<commit_message>
Rebuild CRM page with deeper SEO content, new sections and expanded flip cards
Co-Authored-By: Claude Sonnet 5.5 <noreply@anthropic.com>
Claude-Session: https://claude.ai/code/session_01EvNjF6Z24XTpLixWRFRe99
</commit_message>
<xml_diff>
--- a/crm-page/crm-solutions-uae-content.docx
+++ b/crm-page/crm-solutions-uae-content.docx
@@ -22,7 +22,7 @@
     </w:p>
     <w:p>
       <w:r>
-        <w:t>Meta Description: HAMT Infotech delivers CRM solutions in the UAE: SugarCRM implementation, custom CRM development, integration and consulting for Dubai businesses.</w:t>
+        <w:t>Meta Description: HAMT Infotech offers CRM solutions in the UAE: SugarCRM implementation, custom CRM development, integration, consulting and support for Dubai businesses.</w:t>
       </w:r>
     </w:p>
     <w:p>
@@ -45,6 +45,16 @@
     </w:p>
     <w:p>
       <w:r>
+        <w:t>Strong customer relationships keep a business growing, and a good CRM keeps those relationships organised. HAMT Infotech provides CRM solutions in the UAE that bring your leads, customers, sales and support into one place, so your team spends less time hunting for information and more time closing deals.</w:t>
+      </w:r>
+    </w:p>
+    <w:p>
+      <w:r>
+        <w:t>Whether you need a ready-to-run platform, a CRM built around your own process, or a cleaner setup for a system you already own, our CRM services in the UAE start with your business and not with a product catalogue. Talk to us and we will show you what a well-planned CRM can do for your pipeline, your service quality and your reporting.</w:t>
+      </w:r>
+    </w:p>
+    <w:p>
+      <w:r>
         <w:t>CTA: Get a free consultation</w:t>
       </w:r>
     </w:p>
@@ -58,7 +68,17 @@
     </w:p>
     <w:p>
       <w:r>
-        <w:t>A CRM is far more than a contact list. It records every enquiry, quote, call and complaint, so anyone on your team can pick up a conversation with full context. For companies in Dubai and across the Emirates that handle multilingual customers, fast-moving deals and several teams or branches, that shared view saves time and stops good leads from slipping away.</w:t>
+        <w:t>A CRM is far more than a contact list. It records every enquiry, quote, call, meeting and complaint, so anyone on your team can pick up a conversation with full context. Sales managers see the real pipeline, support teams see the history behind a ticket, and marketing sees which campaigns actually bring in customers.</w:t>
+      </w:r>
+    </w:p>
+    <w:p>
+      <w:r>
+        <w:t>For companies in Dubai, Abu Dhabi, Sharjah and across the Emirates, that shared view matters even more. You may be serving customers in several languages, handling fast-moving deals, working across branches or free zones, and dealing with a mix of email, phone and WhatsApp conversations. Without a central system, leads slip through the gaps and good customers feel ignored.</w:t>
+      </w:r>
+    </w:p>
+    <w:p>
+      <w:r>
+        <w:t>As a SugarCRM partner across the UAE and the wider GCC, we help you choose, set up and grow with CRM software that suits your business. Our CRM services in the UAE cover the whole journey, from CRM consulting and planning to CRM implementation, integration, development and long-term support, all delivered by one accountable team.</w:t>
       </w:r>
     </w:p>
     <w:p>
@@ -71,7 +91,12 @@
     </w:p>
     <w:p>
       <w:r>
-        <w:t>We design a CRM for your UAE business around your sales stages, approval steps and reporting needs, so your team gets a system that feels familiar from the first day.</w:t>
+        <w:t>As a trusted CRM software provider in the UAE, serving clients across the MENA and GCC regions, we build and fine-tune CRM systems that match your workflows, not the other way round. Through our partnership with SugarCRM, you get a platform that is flexible, scalable and ready for AI.</w:t>
+      </w:r>
+    </w:p>
+    <w:p>
+      <w:r>
+        <w:t>Every engagement starts with a simple question: where does your customer process get stuck today? The answer shapes the modules, integrations and reports we build, so the CRM solves real problems from the first day.</w:t>
       </w:r>
     </w:p>
     <w:p>
@@ -84,7 +109,7 @@
     </w:p>
     <w:p>
       <w:r>
-        <w:t>We design a CRM for your UAE business around your sales stages, approval steps and reporting needs, so your team gets a system that feels familiar from the first day.</w:t>
+        <w:t>We design a CRM around your sales stages, approval steps and reporting needs. Screens, fields and automation follow your process, so your team finds the system familiar from the first day and adoption is faster.</w:t>
       </w:r>
     </w:p>
     <w:p>
@@ -92,12 +117,12 @@
         <w:pStyle w:val="Heading3"/>
       </w:pPr>
       <w:r>
-        <w:t>CRM Integration with Your Tools</w:t>
+        <w:t>CRM Integration</w:t>
       </w:r>
     </w:p>
     <w:p>
       <w:r>
-        <w:t>The CRM solutions that we offer can be implemented without interruption of your current tools and software &amp; thus can give you a single avenue in customer management.</w:t>
+        <w:t>We connect the CRM with your ERP, accounting software, website forms, email, calendar, WhatsApp and telephony. Customer data flows between systems on its own, so nobody types the same details twice and every team sees the same numbers.</w:t>
       </w:r>
     </w:p>
     <w:p>
@@ -110,7 +135,7 @@
     </w:p>
     <w:p>
       <w:r>
-        <w:t>Start with the modules you need today. As you add teams, branches or product lines, we extend the CRM without rebuilding it from scratch.</w:t>
+        <w:t>Start with the modules you need today. When you add teams, branches, product lines or new markets, we extend the CRM with new modules, users and workflows without rebuilding what already works.</w:t>
       </w:r>
     </w:p>
     <w:p>
@@ -118,12 +143,12 @@
         <w:pStyle w:val="Heading3"/>
       </w:pPr>
       <w:r>
-        <w:t>CRM Customization and Modules</w:t>
+        <w:t>CRM Customization</w:t>
       </w:r>
     </w:p>
     <w:p>
       <w:r>
-        <w:t>We create and adjust modules, fields, layouts and rules in SugarCRM for sales automation, marketing campaigns and customer support, all matched to how your team works.</w:t>
+        <w:t>We adjust modules, fields, layouts, roles and business rules in SugarCRM, and build new modules where your process needs them. Sales automation, marketing campaigns and customer support all get configured around how your teams really work.</w:t>
       </w:r>
     </w:p>
     <w:p>
@@ -136,7 +161,7 @@
     </w:p>
     <w:p>
       <w:r>
-        <w:t>A clean interface helps your team adopt the CRM quickly, while dashboards and reports show pipeline health, campaign results and service performance as they happen.</w:t>
+        <w:t>A clean, simple interface helps your team adopt the CRM quickly. Dashboards and reports then show pipeline health, campaign results, service performance and team activity in real time, so decisions rest on facts.</w:t>
       </w:r>
     </w:p>
     <w:p>
@@ -144,67 +169,145 @@
         <w:pStyle w:val="Heading2"/>
       </w:pPr>
       <w:r>
-        <w:t>NEW SECTION 1: Custom CRM or Ready-Made CRM: Which Fits Your Business?</w:t>
+        <w:t>NEW SECTION 1: Custom CRM Software Development in the UAE</w:t>
       </w:r>
     </w:p>
     <w:p>
       <w:r>
-        <w:t>Not every company needs the same kind of CRM. Some do very well with a properly configured platform, while others need something that mirrors an unusual process. We help you compare both routes before you commit, so the money you spend goes where it counts.</w:t>
+        <w:t>Sometimes an off-the-shelf CRM is exactly right. Sometimes your pricing rules, approvals or customer data are so specific that forcing them into a standard tool causes more problems than it solves. Our CRM development services in the UAE cover both routes, and we help you choose honestly.</w:t>
       </w:r>
     </w:p>
     <w:p>
       <w:r>
-        <w:t>Ready-Made CRM, Configured for You</w:t>
+        <w:t>A custom CRM is not always built from a blank page. In most projects we start with a proven platform such as SugarCRM and add custom modules, portals, workflows and integrations on top. You keep the reliability, security and upgrade path of an established product, and you gain the parts that make your business different. That approach shortens delivery time and keeps long-term cost under control.</w:t>
       </w:r>
     </w:p>
     <w:p>
       <w:r>
-        <w:t>A platform such as SugarCRM in the UAE can go live quickly. We set up fields, workflows and dashboards, migrate your data and train your team. It suits businesses with standard sales and service processes that want a faster start and predictable costs.</w:t>
+        <w:t xml:space="preserve"> | Custom CRM Development | Configured Ready-Made CRM</w:t>
       </w:r>
     </w:p>
     <w:p>
       <w:r>
-        <w:t>Custom CRM Development</w:t>
+        <w:t>Feature set | Built around your exact process, with only the features you need. | Standard features, with limited room to add new ones.</w:t>
       </w:r>
     </w:p>
     <w:p>
       <w:r>
-        <w:t>When your quoting, approvals, pricing or compliance steps do not fit an off-the-shelf tool, we build custom modules and screens on top of the platform. You keep the strength of a proven CRM and add the parts that are unique to your business.</w:t>
+        <w:t>Time to go live | Longer, because design and development come first. | Faster, since the platform already exists.</w:t>
       </w:r>
     </w:p>
     <w:p>
       <w:r>
-        <w:t>Signs a custom CRM is worth considering</w:t>
+        <w:t>Cost | Higher upfront, with more design and build effort. | Lower upfront, with predictable licence costs.</w:t>
       </w:r>
     </w:p>
     <w:p>
       <w:r>
-        <w:t>Your sales process has several approval or pricing steps that a standard CRM cannot handle.</w:t>
+        <w:t>Fit for unusual processes | Excellent. Custom modules mirror your approvals, pricing and data. | Good for standard sales and service, weaker for unique steps.</w:t>
       </w:r>
     </w:p>
     <w:p>
       <w:r>
-        <w:t>You depend on more than one system, and staff keep re-entering the same data.</w:t>
+        <w:t>Best for | Complex, regulated or highly specialised businesses. | Growing businesses that want a quick, proven start.</w:t>
+      </w:r>
+    </w:p>
+    <w:p>
+      <w:pPr>
+        <w:pStyle w:val="Heading3"/>
+      </w:pPr>
+      <w:r>
+        <w:t>Signs that custom CRM development is worth considering</w:t>
       </w:r>
     </w:p>
     <w:p>
       <w:r>
-        <w:t>Your business tracks industry-specific details such as units, shipments, contracts or patient visits.</w:t>
+        <w:t>Your sales process has several approval, pricing or discount steps that a standard CRM cannot handle cleanly.</w:t>
       </w:r>
     </w:p>
     <w:p>
       <w:r>
-        <w:t>Teams in different branches or countries need different views of the same customer.</w:t>
+        <w:t>You run more than one system, and staff keep re-entering the same data between them.</w:t>
       </w:r>
     </w:p>
     <w:p>
+      <w:r>
+        <w:t>You track industry-specific details such as units, shipments, contracts, patient visits or project stages.</w:t>
+      </w:r>
+    </w:p>
+    <w:p>
+      <w:r>
+        <w:t>Different branches, countries or partner companies need different views of the same customer.</w:t>
+      </w:r>
+    </w:p>
+    <w:p>
+      <w:r>
+        <w:t>You want customers or partners to log in to a portal and see their own quotes, orders or cases.</w:t>
+      </w:r>
+    </w:p>
+    <w:p>
+      <w:pPr>
+        <w:pStyle w:val="Heading3"/>
+      </w:pPr>
+      <w:r>
+        <w:t>Three types of CRM, and where each one helps</w:t>
+      </w:r>
+    </w:p>
+    <w:p>
+      <w:pPr>
+        <w:pStyle w:val="Heading3"/>
+      </w:pPr>
+      <w:r>
+        <w:t>Operational CRM</w:t>
+      </w:r>
+    </w:p>
+    <w:p>
+      <w:r>
+        <w:t>Handles the daily work: lead capture, follow-ups, quotes, service cases and marketing tasks. It automates routine steps so teams stay on top of every customer interaction.</w:t>
+      </w:r>
+    </w:p>
+    <w:p>
+      <w:pPr>
+        <w:pStyle w:val="Heading3"/>
+      </w:pPr>
+      <w:r>
+        <w:t>Analytical CRM</w:t>
+      </w:r>
+    </w:p>
+    <w:p>
+      <w:r>
+        <w:t>Turns customer data into insight. Reports and dashboards show buying patterns, campaign results and sales performance, so managers can plan with facts.</w:t>
+      </w:r>
+    </w:p>
+    <w:p>
+      <w:pPr>
+        <w:pStyle w:val="Heading3"/>
+      </w:pPr>
+      <w:r>
+        <w:t>Collaborative CRM</w:t>
+      </w:r>
+    </w:p>
+    <w:p>
+      <w:r>
+        <w:t>Shares customer information between sales, service, marketing and even partners, so everyone speaks to the customer with the same up-to-date context.</w:t>
+      </w:r>
+    </w:p>
+    <w:p>
+      <w:pPr>
+        <w:pStyle w:val="Heading3"/>
+      </w:pPr>
       <w:r>
         <w:t>SugarCRM UAE with SugarAI</w:t>
       </w:r>
     </w:p>
     <w:p>
       <w:r>
-        <w:t>With the AI-assisted features in the Sugar platform, your CRM can also help you decide what to do next. Predictive lead scoring points your team to the deals most likely to close, forecasting gives managers a clearer view of the quarter, and smart summaries cut down the time spent writing notes. We help you switch these on where they add real value and leave them off where they do not.</w:t>
+        <w:t>With the AI-assisted features in the Sugar platform, your CRM can help you decide what to do next. Predictive lead scoring points your team towards the deals most likely to close. Forecasting gives managers a clearer view of the quarter. Smart summaries cut the time spent writing notes after calls and meetings.</w:t>
+      </w:r>
+    </w:p>
+    <w:p>
+      <w:r>
+        <w:t>We help you switch these on where they add real value, train your team to trust and question the suggestions, and keep them out of the way where they do not. The aim is a CRM that saves time, not one that adds another screen to check.</w:t>
       </w:r>
     </w:p>
     <w:p>
@@ -225,32 +328,32 @@
     </w:p>
     <w:p>
       <w:r>
-        <w:t>CRM Consulting UAE: process review, platform selection and a clear roadmap.</w:t>
+        <w:t>CRM Consulting UAE: we review your sales and service process, shortlist platforms and give you a clear roadmap and budget.</w:t>
       </w:r>
     </w:p>
     <w:p>
       <w:r>
-        <w:t>CRM Implementation UAE: configuration, data migration, user training and go-live.</w:t>
+        <w:t>CRM Implementation UAE: configuration, data migration, user training and a controlled go-live.</w:t>
       </w:r>
     </w:p>
     <w:p>
       <w:r>
-        <w:t>CRM Development UAE: custom modules, screens and automation.</w:t>
+        <w:t>CRM Development UAE: custom modules, screens, portals and automation for processes that standard tools do not cover.</w:t>
       </w:r>
     </w:p>
     <w:p>
       <w:r>
-        <w:t>CRM Customization UAE: tuning an existing CRM to match new processes.</w:t>
+        <w:t>CRM Customization UAE: reshaping an existing CRM to match new teams, products or workflows.</w:t>
       </w:r>
     </w:p>
     <w:p>
       <w:r>
-        <w:t>CRM Integration UAE: linking the CRM with ERP, finance, web and messaging tools.</w:t>
+        <w:t>CRM Integration UAE: linking the CRM with ERP, finance, web, email and messaging tools.</w:t>
       </w:r>
     </w:p>
     <w:p>
       <w:r>
-        <w:t>Support and Optimisation: upgrades, fixes and ongoing improvements.</w:t>
+        <w:t>Support and Optimisation: upgrades, fixes, user support and steady improvements after launch.</w:t>
       </w:r>
     </w:p>
     <w:p>
@@ -271,7 +374,7 @@
     </w:p>
     <w:p>
       <w:r>
-        <w:t>Run the CRM on your own servers and keep full control over infrastructure, data and security policies. This suits organisations with strict internal or regulatory requirements. We handle installation, configuration and training for both your IT and business teams.</w:t>
+        <w:t>Run the CRM on your own servers and keep full control over infrastructure, data location and security policies. This suits organisations with strict internal or regulatory requirements, or those with existing data centre investments. We handle installation, configuration, backups planning and training for both your IT and business teams.</w:t>
       </w:r>
     </w:p>
     <w:p>
@@ -284,7 +387,7 @@
     </w:p>
     <w:p>
       <w:r>
-        <w:t>Access your CRM securely from anywhere without buying or maintaining hardware. Hosting, backups and updates are handled for you, so the system stays available and easy to scale as your team grows.</w:t>
+        <w:t>Access your CRM securely from anywhere without buying or maintaining hardware. Hosting, automated backups and updates are handled for you, so the system stays available, protected and easy to scale as your team grows. Cloud is usually the fastest way to go live, and a good fit for growing and multi-branch businesses.</w:t>
       </w:r>
     </w:p>
     <w:p>
@@ -296,16 +399,8 @@
       </w:r>
     </w:p>
     <w:p>
-      <w:pPr>
-        <w:pStyle w:val="Heading3"/>
-      </w:pPr>
       <w:r>
-        <w:t>1. Discovery and CRM Consulting</w:t>
-      </w:r>
-    </w:p>
-    <w:p>
-      <w:r>
-        <w:t>We sit down with your sales, service and management teams to understand your process, pain points and goals.</w:t>
+        <w:t>A clear, staged approach keeps your project on time and your team confident. Here is what to expect when you work with us.</w:t>
       </w:r>
     </w:p>
     <w:p>
@@ -313,12 +408,12 @@
         <w:pStyle w:val="Heading3"/>
       </w:pPr>
       <w:r>
-        <w:t>2. Solution Design</w:t>
+        <w:t>1. Set clear business goals</w:t>
       </w:r>
     </w:p>
     <w:p>
       <w:r>
-        <w:t>We map workflows, data fields, user roles and reports, and agree the scope before any build begins.</w:t>
+        <w:t>We start with what you want the CRM to achieve: more sales, fewer lost leads, faster support, better reporting or all of these. Clear goals decide which features matter and how success will be measured.</w:t>
       </w:r>
     </w:p>
     <w:p>
@@ -326,12 +421,12 @@
         <w:pStyle w:val="Heading3"/>
       </w:pPr>
       <w:r>
-        <w:t>3. Development and Customization</w:t>
+        <w:t>2. Review security and data requirements</w:t>
       </w:r>
     </w:p>
     <w:p>
       <w:r>
-        <w:t>We configure the platform, build custom modules and set up automation and dashboards.</w:t>
+        <w:t>Customer data is valuable and sensitive. We agree user roles, access rules, audit needs and how your data should be stored and protected, in line with UAE data protection expectations and your own policies.</w:t>
       </w:r>
     </w:p>
     <w:p>
@@ -339,12 +434,12 @@
         <w:pStyle w:val="Heading3"/>
       </w:pPr>
       <w:r>
-        <w:t>4. Integration and Data Migration</w:t>
+        <w:t>3. Design the solution</w:t>
       </w:r>
     </w:p>
     <w:p>
       <w:r>
-        <w:t>We connect your ERP, accounting, email and other tools, and move your existing data in cleanly.</w:t>
+        <w:t>We map your workflows, data fields, user roles, reports and integrations, then share designs and workflow diagrams for approval. You see what will be built before we build it.</w:t>
       </w:r>
     </w:p>
     <w:p>
@@ -352,12 +447,167 @@
         <w:pStyle w:val="Heading3"/>
       </w:pPr>
       <w:r>
-        <w:t>5. Training, Go-Live and Support</w:t>
+        <w:t>4. Build and customize</w:t>
       </w:r>
     </w:p>
     <w:p>
       <w:r>
-        <w:t>We train your users, launch in stages, and stay on hand for support, fixes and improvements.</w:t>
+        <w:t>We configure the platform, develop custom modules and screens, and set up automation, dashboards and notifications. Work is delivered in stages and tested by our QA team at each step.</w:t>
+      </w:r>
+    </w:p>
+    <w:p>
+      <w:pPr>
+        <w:pStyle w:val="Heading3"/>
+      </w:pPr>
+      <w:r>
+        <w:t>5. Integrate and migrate your data</w:t>
+      </w:r>
+    </w:p>
+    <w:p>
+      <w:r>
+        <w:t>We connect your ERP, accounting, email, website and messaging tools, and move your existing customer data from spreadsheets or an old CRM. Records are cleaned and checked so you do not import old problems.</w:t>
+      </w:r>
+    </w:p>
+    <w:p>
+      <w:pPr>
+        <w:pStyle w:val="Heading3"/>
+      </w:pPr>
+      <w:r>
+        <w:t>6. Train, launch and support</w:t>
+      </w:r>
+    </w:p>
+    <w:p>
+      <w:r>
+        <w:t>We train each user group, launch in stages so early feedback can shape the system, and stay on hand afterwards for support, fixes and improvements as your business changes.</w:t>
+      </w:r>
+    </w:p>
+    <w:p>
+      <w:pPr>
+        <w:pStyle w:val="Heading2"/>
+      </w:pPr>
+      <w:r>
+        <w:t>NEW SECTION 3: What Affects CRM Cost and Timeline in the UAE</w:t>
+      </w:r>
+    </w:p>
+    <w:p>
+      <w:r>
+        <w:t>There is no single price for CRM software in the UAE, because no two projects are alike. These are the factors that shape your budget and schedule, so you can plan with confidence.</w:t>
+      </w:r>
+    </w:p>
+    <w:p>
+      <w:pPr>
+        <w:pStyle w:val="Heading3"/>
+      </w:pPr>
+      <w:r>
+        <w:t>Type and scope of CRM</w:t>
+      </w:r>
+    </w:p>
+    <w:p>
+      <w:r>
+        <w:t>A focused sales CRM costs less than a platform covering sales, service, marketing and reporting together. The number of users also drives licence and training costs.</w:t>
+      </w:r>
+    </w:p>
+    <w:p>
+      <w:pPr>
+        <w:pStyle w:val="Heading3"/>
+      </w:pPr>
+      <w:r>
+        <w:t>Level of customization</w:t>
+      </w:r>
+    </w:p>
+    <w:p>
+      <w:r>
+        <w:t>Standard configuration is quicker and lighter on budget. Custom modules, portals and complex workflows need more design and development time.</w:t>
+      </w:r>
+    </w:p>
+    <w:p>
+      <w:pPr>
+        <w:pStyle w:val="Heading3"/>
+      </w:pPr>
+      <w:r>
+        <w:t>Integrations</w:t>
+      </w:r>
+    </w:p>
+    <w:p>
+      <w:r>
+        <w:t>Each connected system, such as ERP, accounting or telephony, adds design and testing work. Well-planned integrations pay for themselves in saved effort.</w:t>
+      </w:r>
+    </w:p>
+    <w:p>
+      <w:pPr>
+        <w:pStyle w:val="Heading3"/>
+      </w:pPr>
+      <w:r>
+        <w:t>Data migration</w:t>
+      </w:r>
+    </w:p>
+    <w:p>
+      <w:r>
+        <w:t>Clean, well-organised data moves quickly. Old spreadsheets and duplicate records take longer to prepare.</w:t>
+      </w:r>
+    </w:p>
+    <w:p>
+      <w:pPr>
+        <w:pStyle w:val="Heading3"/>
+      </w:pPr>
+      <w:r>
+        <w:t>Deployment model</w:t>
+      </w:r>
+    </w:p>
+    <w:p>
+      <w:r>
+        <w:t>Cloud and on-premises setups have different cost profiles for hosting, security and maintenance.</w:t>
+      </w:r>
+    </w:p>
+    <w:p>
+      <w:pPr>
+        <w:pStyle w:val="Heading3"/>
+      </w:pPr>
+      <w:r>
+        <w:t>Support after launch</w:t>
+      </w:r>
+    </w:p>
+    <w:p>
+      <w:r>
+        <w:t>Ongoing support, upgrades and improvements keep the CRM useful. We agree the level you need up front.</w:t>
+      </w:r>
+    </w:p>
+    <w:p>
+      <w:r>
+        <w:t>As a rough guide, a configured cloud CRM can go live in a matter of weeks, while a project with custom modules, several integrations or a large data migration takes longer. After a short discovery call, we give you a clear estimate and timeline based on your real requirements, not a generic quote.</w:t>
+      </w:r>
+    </w:p>
+    <w:p>
+      <w:pPr>
+        <w:pStyle w:val="Heading3"/>
+      </w:pPr>
+      <w:r>
+        <w:t>How to choose a CRM partner in the UAE</w:t>
+      </w:r>
+    </w:p>
+    <w:p>
+      <w:r>
+        <w:t>Look for a partner with proven experience in your industry, and ask for examples of similar work.</w:t>
+      </w:r>
+    </w:p>
+    <w:p>
+      <w:r>
+        <w:t>Check that they can support the whole journey, from consulting to integration and support, so you are not passed between vendors.</w:t>
+      </w:r>
+    </w:p>
+    <w:p>
+      <w:r>
+        <w:t>Ask how they handle training and user adoption, because a CRM that nobody uses delivers nothing.</w:t>
+      </w:r>
+    </w:p>
+    <w:p>
+      <w:r>
+        <w:t>Make sure the team is easy to reach locally, and speaks plainly about cost and risk.</w:t>
+      </w:r>
+    </w:p>
+    <w:p>
+      <w:r>
+        <w:t>Arrange a call before you commit, and see whether they ask about your business before they talk about their product.</w:t>
       </w:r>
     </w:p>
     <w:p>
@@ -378,7 +628,7 @@
     </w:p>
     <w:p>
       <w:r>
-        <w:t>No two businesses sell the same way. We shape the CRM around your process, so your team gets the features it will actually use.</w:t>
+        <w:t>No two businesses sell the same way. We shape the CRM around your process, so your team gets the features it will actually use and none of the clutter it will not.</w:t>
       </w:r>
     </w:p>
     <w:p>
@@ -391,7 +641,7 @@
     </w:p>
     <w:p>
       <w:r>
-        <w:t>As a SugarCRM partner in the UAE, we handle implementation and ongoing support directly, giving you a proven platform and a team that knows it well.</w:t>
+        <w:t>As a SugarCRM partner in the UAE, we handle implementation, customization and ongoing support directly. You get a proven platform and a team that knows it inside out.</w:t>
       </w:r>
     </w:p>
     <w:p>
@@ -404,7 +654,7 @@
     </w:p>
     <w:p>
       <w:r>
-        <w:t>Our CRM consultants and developers have worked across many industries, so you get practical advice from planning through to life after launch.</w:t>
+        <w:t>Our CRM consultants, developers and integration specialists have worked across many industries, so you get practical advice from planning through to life after launch.</w:t>
       </w:r>
     </w:p>
     <w:p>
@@ -417,7 +667,20 @@
     </w:p>
     <w:p>
       <w:r>
-        <w:t>Based in Dubai, we understand how UAE businesses operate and are close by when you need us.</w:t>
+        <w:t>Based in Dubai, we understand how UAE businesses operate, and we are close by when you need us.</w:t>
+      </w:r>
+    </w:p>
+    <w:p>
+      <w:pPr>
+        <w:pStyle w:val="Heading3"/>
+      </w:pPr>
+      <w:r>
+        <w:t>Clear, Honest Advice</w:t>
+      </w:r>
+    </w:p>
+    <w:p>
+      <w:r>
+        <w:t>We tell you plainly whether a configured platform or a custom build suits you, and what each will really involve.</w:t>
       </w:r>
     </w:p>
     <w:p>
@@ -443,7 +706,7 @@
     </w:p>
     <w:p>
       <w:r>
-        <w:t>Link quotes, orders and after-sales service with ERP and inventory data, so sales and production work from the same numbers.</w:t>
+        <w:t>Link quotes, orders, production updates and after-sales service with your ERP and inventory data. Sales and production work from the same numbers, and customers get accurate delivery answers.</w:t>
       </w:r>
     </w:p>
     <w:p>
@@ -456,7 +719,7 @@
     </w:p>
     <w:p>
       <w:r>
-        <w:t>Track listings, enquiries and viewings in one place. Automated follow-ups help agents move buyers and investors to closing faster.</w:t>
+        <w:t>Track listings, enquiries, viewings and offers in one place. Automated follow-ups and clear pipelines help agents move buyers and investors from first call to closing faster.</w:t>
       </w:r>
     </w:p>
     <w:p>
@@ -469,7 +732,7 @@
     </w:p>
     <w:p>
       <w:r>
-        <w:t>Build guest profiles, manage bookings and group enquiries, and run loyalty and feedback campaigns that bring guests back.</w:t>
+        <w:t>Build guest profiles, manage bookings and group enquiries, and run loyalty and feedback campaigns. Know your guests well enough to bring them back.</w:t>
       </w:r>
     </w:p>
     <w:p>
@@ -482,7 +745,7 @@
     </w:p>
     <w:p>
       <w:r>
-        <w:t>Understand purchase history and buying behaviour, then run targeted offers and campaigns that raise repeat sales.</w:t>
+        <w:t>See purchase history and buying behaviour in one profile, then run targeted offers, win-back campaigns and loyalty programmes that raise repeat sales.</w:t>
       </w:r>
     </w:p>
     <w:p>
@@ -495,7 +758,7 @@
     </w:p>
     <w:p>
       <w:r>
-        <w:t>Keep shipment enquiries, customer updates and service issues visible to every team, so delays are handled before they escalate.</w:t>
+        <w:t>Keep shipment enquiries, quotes, customer updates and service issues visible to every team, so delays are handled before they turn into complaints.</w:t>
       </w:r>
     </w:p>
     <w:p>
@@ -508,7 +771,7 @@
     </w:p>
     <w:p>
       <w:r>
-        <w:t>Manage client portfolios, onboarding and renewals with workflows that support compliance and timely, personal advice.</w:t>
+        <w:t>Manage client portfolios, onboarding, renewals and follow-ups with workflows that support compliance. Give clients timely, personal advice backed by a full history.</w:t>
       </w:r>
     </w:p>
     <w:p>
@@ -521,7 +784,7 @@
     </w:p>
     <w:p>
       <w:r>
-        <w:t>Handle appointments, patient follow-ups and department coordination securely, for a smoother experience at every visit.</w:t>
+        <w:t>Handle appointments, patient follow-ups and department coordination securely. Give patients a smoother experience and staff a clear view of every case.</w:t>
       </w:r>
     </w:p>
     <w:p>
@@ -534,7 +797,7 @@
     </w:p>
     <w:p>
       <w:r>
-        <w:t>Manage prospective student enquiries, admission stages and parent communication from first contact to enrolment.</w:t>
+        <w:t>Manage prospective student enquiries, admission stages, counsellor follow-ups and parent communication from first contact through to enrolment.</w:t>
       </w:r>
     </w:p>
     <w:p>
@@ -547,7 +810,7 @@
     </w:p>
     <w:p>
       <w:r>
-        <w:t>Track tenders, project stakeholders, quotes and approvals so opportunities and client commitments are never missed.</w:t>
+        <w:t>Track tenders, project stakeholders, quotes, variations and approvals, so opportunities and client commitments are never missed.</w:t>
       </w:r>
     </w:p>
     <w:p>
@@ -560,7 +823,7 @@
     </w:p>
     <w:p>
       <w:r>
-        <w:t>Follow leads from test drive to delivery, and keep service reminders and warranty follow-ups on schedule.</w:t>
+        <w:t>Follow leads from enquiry to test drive to delivery. Keep service reminders, warranty follow-ups and customer feedback on schedule.</w:t>
       </w:r>
     </w:p>
     <w:p>
@@ -573,7 +836,7 @@
     </w:p>
     <w:p>
       <w:r>
-        <w:t>Manage proposals, client engagements and renewals with clear visibility of the pipeline and account health.</w:t>
+        <w:t>Manage proposals, client engagements, renewals and account health. Partners see the pipeline, and teams see what each client needs next.</w:t>
       </w:r>
     </w:p>
     <w:p>
@@ -586,7 +849,7 @@
     </w:p>
     <w:p>
       <w:r>
-        <w:t>Handle contracts, renewals, upsell opportunities and support cases for customers who expect quick, accurate service.</w:t>
+        <w:t>Handle contracts, renewals, upsell opportunities and support cases for customers who expect fast, accurate service across every channel.</w:t>
       </w:r>
     </w:p>
     <w:p>
@@ -594,7 +857,7 @@
         <w:pStyle w:val="Heading2"/>
       </w:pPr>
       <w:r>
-        <w:t>NEW SECTION 3: CRM Solutions UAE: Frequently Asked Questions</w:t>
+        <w:t>NEW SECTION 4: CRM Solutions UAE: Frequently Asked Questions</w:t>
       </w:r>
     </w:p>
     <w:p>
@@ -615,12 +878,25 @@
         <w:pStyle w:val="Heading3"/>
       </w:pPr>
       <w:r>
+        <w:t>What is the difference between CRM software, CRM services and CRM solutions?</w:t>
+      </w:r>
+    </w:p>
+    <w:p>
+      <w:r>
+        <w:t>CRM software is the platform itself, such as SugarCRM. CRM services are the work around it: consulting, implementation, customization, integration and support. A CRM solution is the complete result, the right software set up, connected and supported to fit your business. At HAMT Infotech we provide all three.</w:t>
+      </w:r>
+    </w:p>
+    <w:p>
+      <w:pPr>
+        <w:pStyle w:val="Heading3"/>
+      </w:pPr>
+      <w:r>
         <w:t>How much do CRM solutions in the UAE cost?</w:t>
       </w:r>
     </w:p>
     <w:p>
       <w:r>
-        <w:t>Cost depends on the platform, the number of users, how much customization you need and which systems must be integrated. A configured cloud CRM costs far less than a fully custom build. After a short discovery call we can give you a clear estimate based on your actual requirements.</w:t>
+        <w:t>Cost depends on the platform, the number of users, how much customization you need, which systems must be integrated and how much data must be migrated. A configured cloud CRM costs far less than a fully custom build. After a short discovery call we give you a clear estimate based on your actual requirements.</w:t>
       </w:r>
     </w:p>
     <w:p>
@@ -641,12 +917,12 @@
         <w:pStyle w:val="Heading3"/>
       </w:pPr>
       <w:r>
-        <w:t>Can you connect the CRM to our ERP, accounting and other systems?</w:t>
+        <w:t>Should we choose a custom CRM or a ready-made CRM like SugarCRM?</w:t>
       </w:r>
     </w:p>
     <w:p>
       <w:r>
-        <w:t>Yes. CRM integration is a core part of our work. We connect the CRM with ERP and accounting tools, your website and forms, email, telephony and messaging platforms, so data moves between systems automatically.</w:t>
+        <w:t>If your processes are fairly standard, a configured platform is usually faster and more economical. If you have unique workflows, pricing rules or industry data, custom development on top of a platform gives you the best of both. We will tell you honestly which route suits you.</w:t>
       </w:r>
     </w:p>
     <w:p>
@@ -654,12 +930,51 @@
         <w:pStyle w:val="Heading3"/>
       </w:pPr>
       <w:r>
-        <w:t>Should we choose a custom CRM or a ready-made CRM like SugarCRM?</w:t>
+        <w:t>Can you connect the CRM to our ERP, accounting and other systems?</w:t>
       </w:r>
     </w:p>
     <w:p>
       <w:r>
-        <w:t>If your processes are fairly standard, a configured platform is usually faster and more economical. If you have unique workflows, pricing rules or industry data, custom development on top of a platform gives you the best of both. We will tell you honestly which route suits you.</w:t>
+        <w:t>Yes. CRM integration is a core part of our work. We connect the CRM with ERP and accounting tools, your website and forms, email and calendar, telephony and messaging platforms, so data moves between systems automatically.</w:t>
+      </w:r>
+    </w:p>
+    <w:p>
+      <w:pPr>
+        <w:pStyle w:val="Heading3"/>
+      </w:pPr>
+      <w:r>
+        <w:t>Can you move our data from spreadsheets or our current CRM?</w:t>
+      </w:r>
+    </w:p>
+    <w:p>
+      <w:r>
+        <w:t>Yes. We review, clean and map your existing data, then migrate it in stages and check the results with your team. This avoids duplicates and gaps, and lets you start with a clean, trusted database.</w:t>
+      </w:r>
+    </w:p>
+    <w:p>
+      <w:pPr>
+        <w:pStyle w:val="Heading3"/>
+      </w:pPr>
+      <w:r>
+        <w:t>Is cloud or on-premises CRM better for us?</w:t>
+      </w:r>
+    </w:p>
+    <w:p>
+      <w:r>
+        <w:t>Cloud CRM is usually faster to launch, easier to scale and free of hardware upkeep. On-premises CRM suits organisations that need full control over infrastructure and data location. We compare both against your security, budget and growth plans before you decide.</w:t>
+      </w:r>
+    </w:p>
+    <w:p>
+      <w:pPr>
+        <w:pStyle w:val="Heading3"/>
+      </w:pPr>
+      <w:r>
+        <w:t>What does SugarAI add to SugarCRM?</w:t>
+      </w:r>
+    </w:p>
+    <w:p>
+      <w:r>
+        <w:t>SugarAI features help your team work smarter, with predictive lead scoring, forecasting support and summaries that reduce manual note taking. We enable them where they help and train your users to get value from them.</w:t>
       </w:r>
     </w:p>
     <w:p>

</xml_diff>

<commit_message>
Rebuild CRM page: user-journey order, SugarAI, HLB industries as flip cards
Co-Authored-By: Claude Sonnet 5.5 <noreply@anthropic.com>
Claude-Session: https://claude.ai/code/session_01EvNjF6Z24XTpLixWRFRe99
</commit_message>
<xml_diff>
--- a/crm-page/crm-solutions-uae-content.docx
+++ b/crm-page/crm-solutions-uae-content.docx
@@ -22,7 +22,7 @@
     </w:p>
     <w:p>
       <w:r>
-        <w:t>Meta Description: HAMT Infotech offers CRM solutions in the UAE: SugarCRM implementation, custom CRM development, integration, consulting and support for Dubai businesses.</w:t>
+        <w:t>Meta Description: HAMT Infotech provides CRM solutions in the UAE: SugarAI CRM implementation, consulting, development, customization and integration for GCC businesses.</w:t>
       </w:r>
     </w:p>
     <w:p>
@@ -32,7 +32,7 @@
     </w:p>
     <w:p>
       <w:r>
-        <w:t>Secondary keywords: CRM Implementation UAE, CRM Consulting UAE, CRM Development UAE, CRM Customization UAE, CRM Integration UAE, SugarCRM UAE</w:t>
+        <w:t>Secondary keywords: CRM Implementation UAE, CRM Consulting UAE, CRM Development UAE, CRM Customization UAE, CRM Integration UAE, SugarAI CRM UAE</w:t>
       </w:r>
     </w:p>
     <w:p>
@@ -40,17 +40,17 @@
         <w:pStyle w:val="Heading2"/>
       </w:pPr>
       <w:r>
-        <w:t>Hero: Custom CRM Software Provider in Dubai &amp; UAE</w:t>
+        <w:t>1. Hero: Custom CRM Software Provider in Dubai &amp; UAE</w:t>
       </w:r>
     </w:p>
     <w:p>
       <w:r>
-        <w:t>Strong customer relationships keep a business growing, and a good CRM keeps those relationships organised. HAMT Infotech provides CRM solutions in the UAE that bring your leads, customers, sales and support into one place, so your team spends less time hunting for information and more time closing deals.</w:t>
+        <w:t>Most UAE businesses already hold plenty of customer data. It sits in inboxes, spreadsheets, WhatsApp chats and the heads of a few key people. HAMT Infotech brings it into one CRM, so your team can see every lead, deal and customer conversation in one place.</w:t>
       </w:r>
     </w:p>
     <w:p>
       <w:r>
-        <w:t>Whether you need a ready-to-run platform, a CRM built around your own process, or a cleaner setup for a system you already own, our CRM services in the UAE start with your business and not with a product catalogue. Talk to us and we will show you what a well-planned CRM can do for your pipeline, your service quality and your reporting.</w:t>
+        <w:t>As a CRM solutions provider in the UAE, we help you choose the right platform, set it up around your process, connect it to your ERP and keep it running well after go-live. Start with a free consultation and see what a CRM could change in your sales and service.</w:t>
       </w:r>
     </w:p>
     <w:p>
@@ -63,22 +63,22 @@
         <w:pStyle w:val="Heading2"/>
       </w:pPr>
       <w:r>
-        <w:t>H1: CRM Solutions UAE Built Around Your Business</w:t>
+        <w:t>2. H1: CRM Solutions UAE Built Around Your Business</w:t>
       </w:r>
     </w:p>
     <w:p>
       <w:r>
-        <w:t>A CRM is far more than a contact list. It records every enquiry, quote, call, meeting and complaint, so anyone on your team can pick up a conversation with full context. Sales managers see the real pipeline, support teams see the history behind a ticket, and marketing sees which campaigns actually bring in customers.</w:t>
+        <w:t>A CRM is where your sales, service and marketing teams share one version of the customer. Every enquiry, quote, call and complaint is recorded, so anyone can pick up a conversation without asking the customer to repeat themselves.</w:t>
       </w:r>
     </w:p>
     <w:p>
       <w:r>
-        <w:t>For companies in Dubai, Abu Dhabi, Sharjah and across the Emirates, that shared view matters even more. You may be serving customers in several languages, handling fast-moving deals, working across branches or free zones, and dealing with a mix of email, phone and WhatsApp conversations. Without a central system, leads slip through the gaps and good customers feel ignored.</w:t>
+        <w:t>In the UAE, that shared view carries extra weight. Customers write in English and Arabic, deals move quickly, leads arrive from property portals, WhatsApp and referrals, and teams often work across several branches or entities. Good CRM software in the UAE keeps all of this organised and stops promising opportunities from slipping away.</w:t>
       </w:r>
     </w:p>
     <w:p>
       <w:r>
-        <w:t>As a SugarCRM partner across the UAE and the wider GCC, we help you choose, set up and grow with CRM software that suits your business. Our CRM services in the UAE cover the whole journey, from CRM consulting and planning to CRM implementation, integration, development and long-term support, all delivered by one accountable team.</w:t>
+        <w:t>HAMT Infotech has worked with UAE and GCC businesses for 26 years, both advising on how they operate and building the systems they run on. We deliver CRM on SugarAI, the intelligent evolution of Sugar CRM, and take responsibility for the whole project, from the first workshop to support after launch.</w:t>
       </w:r>
     </w:p>
     <w:p>
@@ -86,17 +86,17 @@
         <w:pStyle w:val="Heading2"/>
       </w:pPr>
       <w:r>
-        <w:t>Our CRM Offerings</w:t>
+        <w:t>3. Our CRM Offerings</w:t>
       </w:r>
     </w:p>
     <w:p>
       <w:r>
-        <w:t>As a trusted CRM software provider in the UAE, serving clients across the MENA and GCC regions, we build and fine-tune CRM systems that match your workflows, not the other way round. Through our partnership with SugarCRM, you get a platform that is flexible, scalable and ready for AI.</w:t>
+        <w:t>Our CRM services in the UAE cover the full life of a CRM, whether you are choosing one for the first time or fixing one that is not working. Everything is built on SugarAI and delivered by one team, so nothing gets lost between consultants, developers and support.</w:t>
       </w:r>
     </w:p>
     <w:p>
       <w:r>
-        <w:t>Every engagement starts with a simple question: where does your customer process get stuck today? The answer shapes the modules, integrations and reports we build, so the CRM solves real problems from the first day.</w:t>
+        <w:t>Take one service or combine several. Each is described below.</w:t>
       </w:r>
     </w:p>
     <w:p>
@@ -104,12 +104,25 @@
         <w:pStyle w:val="Heading3"/>
       </w:pPr>
       <w:r>
-        <w:t>Custom CRM Development</w:t>
+        <w:t>CRM Implementation &amp; Deployment</w:t>
       </w:r>
     </w:p>
     <w:p>
       <w:r>
-        <w:t>We design a CRM around your sales stages, approval steps and reporting needs. Screens, fields and automation follow your process, so your team finds the system familiar from the first day and adoption is faster.</w:t>
+        <w:t>CRM implementation in the UAE starts with your sales stages, not a blank screen. We configure SugarAI, move in your key data and train your users. Go live fast with a Jump Start package, then add more as you grow, on cloud, private cloud or your own servers.</w:t>
+      </w:r>
+    </w:p>
+    <w:p>
+      <w:pPr>
+        <w:pStyle w:val="Heading3"/>
+      </w:pPr>
+      <w:r>
+        <w:t>Tailored CRM Development</w:t>
+      </w:r>
+    </w:p>
+    <w:p>
+      <w:r>
+        <w:t>When a standard screen does not fit your process, we build what does. Our CRM development in the UAE adds custom fields, modules and plugins inside SugarAI, so your team finds the data it needs in one place and responds faster.</w:t>
       </w:r>
     </w:p>
     <w:p>
@@ -122,7 +135,7 @@
     </w:p>
     <w:p>
       <w:r>
-        <w:t>We connect the CRM with your ERP, accounting software, website forms, email, calendar, WhatsApp and telephony. Customer data flows between systems on its own, so nobody types the same details twice and every team sees the same numbers.</w:t>
+        <w:t>CRM integration in the UAE links SugarAI with your ERP, finance system, website and marketing tools. Quotes, orders and invoices appear on the customer record without anyone typing them twice.</w:t>
       </w:r>
     </w:p>
     <w:p>
@@ -130,12 +143,12 @@
         <w:pStyle w:val="Heading3"/>
       </w:pPr>
       <w:r>
-        <w:t>Scalable CRM Solutions</w:t>
+        <w:t>CRM Migration &amp; Optimisation</w:t>
       </w:r>
     </w:p>
     <w:p>
       <w:r>
-        <w:t>Start with the modules you need today. When you add teams, branches, product lines or new markets, we extend the CRM with new modules, users and workflows without rebuilding what already works.</w:t>
+        <w:t>Moving from a legacy CRM or spreadsheets? We clean and map your data and carry across the history that matters. Already on SugarAI? CRM customization and tuning of your workflows and reports helps the system work harder for you.</w:t>
       </w:r>
     </w:p>
     <w:p>
@@ -143,12 +156,20 @@
         <w:pStyle w:val="Heading3"/>
       </w:pPr>
       <w:r>
-        <w:t>CRM Customization</w:t>
+        <w:t>CRM Consulting &amp; Evaluation</w:t>
       </w:r>
     </w:p>
     <w:p>
       <w:r>
-        <w:t>We adjust modules, fields, layouts, roles and business rules in SugarCRM, and build new modules where your process needs them. Sales automation, marketing campaigns and customer support all get configured around how your teams really work.</w:t>
+        <w:t>Not sure which CRM to buy? Our CRM consulting in the UAE gives independent advice on platform choice, licensing and how your teams should work in it, before you commit to a project.</w:t>
+      </w:r>
+    </w:p>
+    <w:p>
+      <w:pPr>
+        <w:pStyle w:val="Heading2"/>
+      </w:pPr>
+      <w:r>
+        <w:t>4. Features: What You Get with Our CRM Solutions</w:t>
       </w:r>
     </w:p>
     <w:p>
@@ -156,12 +177,77 @@
         <w:pStyle w:val="Heading3"/>
       </w:pPr>
       <w:r>
-        <w:t>Easy to Use, Easy to Measure</w:t>
+        <w:t>Lead and Opportunity Management</w:t>
       </w:r>
     </w:p>
     <w:p>
       <w:r>
-        <w:t>A clean, simple interface helps your team adopt the CRM quickly. Dashboards and reports then show pipeline health, campaign results, service performance and team activity in real time, so decisions rest on facts.</w:t>
+        <w:t>Leads from your website, portals and campaigns reach the right person straight away. Each opportunity has a clear stage, owner and next step, so nothing goes quiet.</w:t>
+      </w:r>
+    </w:p>
+    <w:p>
+      <w:pPr>
+        <w:pStyle w:val="Heading3"/>
+      </w:pPr>
+      <w:r>
+        <w:t>Mobile Access</w:t>
+      </w:r>
+    </w:p>
+    <w:p>
+      <w:r>
+        <w:t>Check a customer's history before a meeting, log a call from the car park or approve a quote from your phone. Your field team stays up to date without phoning the office.</w:t>
+      </w:r>
+    </w:p>
+    <w:p>
+      <w:pPr>
+        <w:pStyle w:val="Heading3"/>
+      </w:pPr>
+      <w:r>
+        <w:t>Customer Support Tools</w:t>
+      </w:r>
+    </w:p>
+    <w:p>
+      <w:r>
+        <w:t>Cases from email, chat and phone sit in one console with the full customer history. Routing and SLA tracking show which cases are at risk before the customer complains.</w:t>
+      </w:r>
+    </w:p>
+    <w:p>
+      <w:pPr>
+        <w:pStyle w:val="Heading3"/>
+      </w:pPr>
+      <w:r>
+        <w:t>Workflow Management</w:t>
+      </w:r>
+    </w:p>
+    <w:p>
+      <w:r>
+        <w:t>Set the rules once. Follow-up reminders, approvals and hand-offs between teams then happen automatically, in the right order and on time.</w:t>
+      </w:r>
+    </w:p>
+    <w:p>
+      <w:pPr>
+        <w:pStyle w:val="Heading3"/>
+      </w:pPr>
+      <w:r>
+        <w:t>Pipeline Management</w:t>
+      </w:r>
+    </w:p>
+    <w:p>
+      <w:r>
+        <w:t>See every deal by stage and by owner. AI deal scoring and forecasting show which deals are gaining momentum and which are stalling.</w:t>
+      </w:r>
+    </w:p>
+    <w:p>
+      <w:pPr>
+        <w:pStyle w:val="Heading3"/>
+      </w:pPr>
+      <w:r>
+        <w:t>Marketing Automation</w:t>
+      </w:r>
+    </w:p>
+    <w:p>
+      <w:r>
+        <w:t>Build emails, landing pages and nurture journeys without code. Lead scoring tells sales which prospects are ready for a call.</w:t>
       </w:r>
     </w:p>
     <w:p>
@@ -169,47 +255,12 @@
         <w:pStyle w:val="Heading2"/>
       </w:pPr>
       <w:r>
-        <w:t>NEW SECTION 1: Custom CRM Software Development in the UAE</w:t>
+        <w:t>5. NEW SECTION: SugarAI: The CRM Platform We Build On</w:t>
       </w:r>
     </w:p>
     <w:p>
       <w:r>
-        <w:t>Sometimes an off-the-shelf CRM is exactly right. Sometimes your pricing rules, approvals or customer data are so specific that forcing them into a standard tool causes more problems than it solves. Our CRM development services in the UAE cover both routes, and we help you choose honestly.</w:t>
-      </w:r>
-    </w:p>
-    <w:p>
-      <w:r>
-        <w:t>A custom CRM is not always built from a blank page. In most projects we start with a proven platform such as SugarCRM and add custom modules, portals, workflows and integrations on top. You keep the reliability, security and upgrade path of an established product, and you gain the parts that make your business different. That approach shortens delivery time and keeps long-term cost under control.</w:t>
-      </w:r>
-    </w:p>
-    <w:p>
-      <w:r>
-        <w:t xml:space="preserve"> | Custom CRM Development | Configured Ready-Made CRM</w:t>
-      </w:r>
-    </w:p>
-    <w:p>
-      <w:r>
-        <w:t>Feature set | Built around your exact process, with only the features you need. | Standard features, with limited room to add new ones.</w:t>
-      </w:r>
-    </w:p>
-    <w:p>
-      <w:r>
-        <w:t>Time to go live | Longer, because design and development come first. | Faster, since the platform already exists.</w:t>
-      </w:r>
-    </w:p>
-    <w:p>
-      <w:r>
-        <w:t>Cost | Higher upfront, with more design and build effort. | Lower upfront, with predictable licence costs.</w:t>
-      </w:r>
-    </w:p>
-    <w:p>
-      <w:r>
-        <w:t>Fit for unusual processes | Excellent. Custom modules mirror your approvals, pricing and data. | Good for standard sales and service, weaker for unique steps.</w:t>
-      </w:r>
-    </w:p>
-    <w:p>
-      <w:r>
-        <w:t>Best for | Complex, regulated or highly specialised businesses. | Growing businesses that want a quick, proven start.</w:t>
+        <w:t>SugarAI is the intelligent evolution of Sugar CRM, the platform thousands of businesses use for sales, service and marketing. It adds built-in predictive AI for every user, and it runs on the cloud or on your own servers, so you can meet UAE and GCC data residency needs.</w:t>
       </w:r>
     </w:p>
     <w:p>
@@ -217,32 +268,61 @@
         <w:pStyle w:val="Heading3"/>
       </w:pPr>
       <w:r>
-        <w:t>Signs that custom CRM development is worth considering</w:t>
+        <w:t>Three modules, one platform</w:t>
+      </w:r>
+    </w:p>
+    <w:p>
+      <w:pPr>
+        <w:pStyle w:val="Heading4"/>
+      </w:pPr>
+      <w:r>
+        <w:t>SugarAI Sell</w:t>
       </w:r>
     </w:p>
     <w:p>
       <w:r>
-        <w:t>Your sales process has several approval, pricing or discount steps that a standard CRM cannot handle cleanly.</w:t>
+        <w:t>Helps reps focus on the right accounts at the right moment. They see which deals are gaining momentum and which are stalling, and built-in forecasting shows what is most likely to close.</w:t>
       </w:r>
     </w:p>
     <w:p>
       <w:r>
-        <w:t>You run more than one system, and staff keep re-entering the same data between them.</w:t>
+        <w:t>Key functions: Pipeline tracking and forecasting, AI deal scoring, Next-best-action guidance, Ready-made ERP integrations</w:t>
+      </w:r>
+    </w:p>
+    <w:p>
+      <w:pPr>
+        <w:pStyle w:val="Heading4"/>
+      </w:pPr>
+      <w:r>
+        <w:t>SugarAI Serve</w:t>
       </w:r>
     </w:p>
     <w:p>
       <w:r>
-        <w:t>You track industry-specific details such as units, shipments, contracts, patient visits or project stages.</w:t>
+        <w:t>Keeps every case, channel and customer history in one console. Whether a customer writes, chats, calls or uses self-service, the agent sees the whole story in one thread.</w:t>
       </w:r>
     </w:p>
     <w:p>
       <w:r>
-        <w:t>Different branches, countries or partner companies need different views of the same customer.</w:t>
+        <w:t>Key functions: Omnichannel case management, SLA and escalation tracking, Knowledge base integration, At-risk account alerts</w:t>
+      </w:r>
+    </w:p>
+    <w:p>
+      <w:pPr>
+        <w:pStyle w:val="Heading4"/>
+      </w:pPr>
+      <w:r>
+        <w:t>SugarAI Market</w:t>
       </w:r>
     </w:p>
     <w:p>
       <w:r>
-        <w:t>You want customers or partners to log in to a portal and see their own quotes, orders or cases.</w:t>
+        <w:t>Lets you build personalised campaigns without code. Emails, landing pages and nurture journeys run from one place, and lead scoring points sales to prospects ready to talk.</w:t>
+      </w:r>
+    </w:p>
+    <w:p>
+      <w:r>
+        <w:t>Key functions: No-code campaign builder, Multi-channel personalisation, Lead scoring and nurture tracks, Full-journey attribution</w:t>
       </w:r>
     </w:p>
     <w:p>
@@ -250,64 +330,51 @@
         <w:pStyle w:val="Heading3"/>
       </w:pPr>
       <w:r>
-        <w:t>Three types of CRM, and where each one helps</w:t>
+        <w:t>What the AI layer does for your team</w:t>
       </w:r>
     </w:p>
     <w:p>
       <w:pPr>
-        <w:pStyle w:val="Heading3"/>
+        <w:pStyle w:val="Heading4"/>
       </w:pPr>
       <w:r>
-        <w:t>Operational CRM</w:t>
+        <w:t>It predicts</w:t>
       </w:r>
     </w:p>
     <w:p>
       <w:r>
-        <w:t>Handles the daily work: lead capture, follow-ups, quotes, service cases and marketing tasks. It automates routine steps so teams stay on top of every customer interaction.</w:t>
+        <w:t>Scores every lead, opportunity and account, flags deals that are losing momentum and forecasts what will close.</w:t>
       </w:r>
     </w:p>
     <w:p>
       <w:pPr>
-        <w:pStyle w:val="Heading3"/>
+        <w:pStyle w:val="Heading4"/>
       </w:pPr>
       <w:r>
-        <w:t>Analytical CRM</w:t>
+        <w:t>It summarises</w:t>
       </w:r>
     </w:p>
     <w:p>
       <w:r>
-        <w:t>Turns customer data into insight. Reports and dashboards show buying patterns, campaign results and sales performance, so managers can plan with facts.</w:t>
+        <w:t>Drafts account summaries and meeting prep automatically, so reps stop piecing together context by hand.</w:t>
       </w:r>
     </w:p>
     <w:p>
       <w:pPr>
-        <w:pStyle w:val="Heading3"/>
+        <w:pStyle w:val="Heading4"/>
       </w:pPr>
       <w:r>
-        <w:t>Collaborative CRM</w:t>
+        <w:t>It guides</w:t>
       </w:r>
     </w:p>
     <w:p>
       <w:r>
-        <w:t>Shares customer information between sales, service, marketing and even partners, so everyone speaks to the customer with the same up-to-date context.</w:t>
-      </w:r>
-    </w:p>
-    <w:p>
-      <w:pPr>
-        <w:pStyle w:val="Heading3"/>
-      </w:pPr>
-      <w:r>
-        <w:t>SugarCRM UAE with SugarAI</w:t>
+        <w:t>Suggests the next best action for each rep, so the CRM behaves like a coach and not an archive.</w:t>
       </w:r>
     </w:p>
     <w:p>
       <w:r>
-        <w:t>With the AI-assisted features in the Sugar platform, your CRM can help you decide what to do next. Predictive lead scoring points your team towards the deals most likely to close. Forecasting gives managers a clearer view of the quarter. Smart summaries cut the time spent writing notes after calls and meetings.</w:t>
-      </w:r>
-    </w:p>
-    <w:p>
-      <w:r>
-        <w:t>We help you switch these on where they add real value, train your team to trust and question the suggestions, and keep them out of the way where they do not. The aim is a CRM that saves time, not one that adds another screen to check.</w:t>
+        <w:t>SugarAI is built to work with incomplete data. Most CRM records are partial or ageing, so you get useful predictions from day one and do not have to wait for a perfect database.</w:t>
       </w:r>
     </w:p>
     <w:p>
@@ -315,53 +382,7 @@
         <w:pStyle w:val="Heading2"/>
       </w:pPr>
       <w:r>
-        <w:t>Features: What You Get with Our CRM Software in the UAE</w:t>
-      </w:r>
-    </w:p>
-    <w:p>
-      <w:pPr>
-        <w:pStyle w:val="Heading2"/>
-      </w:pPr>
-      <w:r>
-        <w:t>Choose the CRM Service that Fits Your Needs</w:t>
-      </w:r>
-    </w:p>
-    <w:p>
-      <w:r>
-        <w:t>CRM Consulting UAE: we review your sales and service process, shortlist platforms and give you a clear roadmap and budget.</w:t>
-      </w:r>
-    </w:p>
-    <w:p>
-      <w:r>
-        <w:t>CRM Implementation UAE: configuration, data migration, user training and a controlled go-live.</w:t>
-      </w:r>
-    </w:p>
-    <w:p>
-      <w:r>
-        <w:t>CRM Development UAE: custom modules, screens, portals and automation for processes that standard tools do not cover.</w:t>
-      </w:r>
-    </w:p>
-    <w:p>
-      <w:r>
-        <w:t>CRM Customization UAE: reshaping an existing CRM to match new teams, products or workflows.</w:t>
-      </w:r>
-    </w:p>
-    <w:p>
-      <w:r>
-        <w:t>CRM Integration UAE: linking the CRM with ERP, finance, web, email and messaging tools.</w:t>
-      </w:r>
-    </w:p>
-    <w:p>
-      <w:r>
-        <w:t>Support and Optimisation: upgrades, fixes, user support and steady improvements after launch.</w:t>
-      </w:r>
-    </w:p>
-    <w:p>
-      <w:pPr>
-        <w:pStyle w:val="Heading2"/>
-      </w:pPr>
-      <w:r>
-        <w:t>CRM Deployment Options</w:t>
+        <w:t>6. CRM Deployment Options</w:t>
       </w:r>
     </w:p>
     <w:p>
@@ -374,7 +395,7 @@
     </w:p>
     <w:p>
       <w:r>
-        <w:t>Run the CRM on your own servers and keep full control over infrastructure, data location and security policies. This suits organisations with strict internal or regulatory requirements, or those with existing data centre investments. We handle installation, configuration, backups planning and training for both your IT and business teams.</w:t>
+        <w:t>Host SugarAI on your own servers and keep your data inside your own environment, which many banks, healthcare providers and regulated businesses require. We install and configure it, plan your backups and train both your IT and business teams.</w:t>
       </w:r>
     </w:p>
     <w:p>
@@ -387,7 +408,7 @@
     </w:p>
     <w:p>
       <w:r>
-        <w:t>Access your CRM securely from anywhere without buying or maintaining hardware. Hosting, automated backups and updates are handled for you, so the system stays available, protected and easy to scale as your team grows. Cloud is usually the fastest way to go live, and a good fit for growing and multi-branch businesses.</w:t>
+        <w:t>We host SugarAI in a secure cloud, or in a private cloud if you want a dedicated environment. There is no hardware to buy or maintain, backups and updates are handled for you, and the system grows with your team. We help you pick the model that meets your UAE and GCC data residency needs.</w:t>
       </w:r>
     </w:p>
     <w:p>
@@ -395,12 +416,12 @@
         <w:pStyle w:val="Heading2"/>
       </w:pPr>
       <w:r>
-        <w:t>NEW SECTION 2: How Our CRM Implementation in the UAE Works</w:t>
+        <w:t>7. NEW SECTION: How We Deliver Your CRM</w:t>
       </w:r>
     </w:p>
     <w:p>
       <w:r>
-        <w:t>A clear, staged approach keeps your project on time and your team confident. Here is what to expect when you work with us.</w:t>
+        <w:t>You choose the pace. Some teams want a working system fast, others need a carefully phased programme. Either way, scope and timelines are agreed before work begins.</w:t>
       </w:r>
     </w:p>
     <w:p>
@@ -408,12 +429,12 @@
         <w:pStyle w:val="Heading3"/>
       </w:pPr>
       <w:r>
-        <w:t>1. Set clear business goals</w:t>
+        <w:t>Guided Low-Touch Onboarding: Live in Days</w:t>
       </w:r>
     </w:p>
     <w:p>
       <w:r>
-        <w:t>We start with what you want the CRM to achieve: more sales, fewer lost leads, faster support, better reporting or all of these. Clear goals decide which features matter and how success will be measured.</w:t>
+        <w:t>Use the best practices already built into SugarAI instead of a long services project. We provision a working system on day one and give you a dedicated Onboarding Advisor. Your team learns the system as it goes live, so ownership comes naturally. Training paths from Sugar University and Sugar Club keep the learning going.</w:t>
       </w:r>
     </w:p>
     <w:p>
@@ -421,12 +442,12 @@
         <w:pStyle w:val="Heading3"/>
       </w:pPr>
       <w:r>
-        <w:t>2. Review security and data requirements</w:t>
+        <w:t>Phased Delivery for Complex Programmes</w:t>
       </w:r>
     </w:p>
     <w:p>
       <w:r>
-        <w:t>Customer data is valuable and sensitive. We agree user roles, access rules, audit needs and how your data should be stored and protected, in line with UAE data protection expectations and your own policies.</w:t>
+        <w:t>For larger groups with several entities, ERP integration and heavy customization, we work in phases. Each phase has agreed scope, a named engagement lead and clear sign-offs, so everyone knows what is coming next.</w:t>
       </w:r>
     </w:p>
     <w:p>
@@ -434,51 +455,85 @@
         <w:pStyle w:val="Heading3"/>
       </w:pPr>
       <w:r>
-        <w:t>3. Design the solution</w:t>
+        <w:t>What happens after you contact us</w:t>
+      </w:r>
+    </w:p>
+    <w:p>
+      <w:pPr>
+        <w:pStyle w:val="Heading4"/>
+      </w:pPr>
+      <w:r>
+        <w:t>1. Discovery</w:t>
       </w:r>
     </w:p>
     <w:p>
       <w:r>
-        <w:t>We map your workflows, data fields, user roles, reports and integrations, then share designs and workflow diagrams for approval. You see what will be built before we build it.</w:t>
+        <w:t>We sit with your sales, service and management teams to understand how you work today and what is holding you back.</w:t>
       </w:r>
     </w:p>
     <w:p>
       <w:pPr>
-        <w:pStyle w:val="Heading3"/>
+        <w:pStyle w:val="Heading4"/>
       </w:pPr>
       <w:r>
-        <w:t>4. Build and customize</w:t>
+        <w:t>2. Plan and scope</w:t>
       </w:r>
     </w:p>
     <w:p>
       <w:r>
-        <w:t>We configure the platform, develop custom modules and screens, and set up automation, dashboards and notifications. Work is delivered in stages and tested by our QA team at each step.</w:t>
+        <w:t>We agree what will be built, in what order and by when, before any work starts.</w:t>
       </w:r>
     </w:p>
     <w:p>
       <w:pPr>
-        <w:pStyle w:val="Heading3"/>
+        <w:pStyle w:val="Heading4"/>
       </w:pPr>
       <w:r>
-        <w:t>5. Integrate and migrate your data</w:t>
+        <w:t>3. Configure and build</w:t>
       </w:r>
     </w:p>
     <w:p>
       <w:r>
-        <w:t>We connect your ERP, accounting, email, website and messaging tools, and move your existing customer data from spreadsheets or an old CRM. Records are cleaned and checked so you do not import old problems.</w:t>
+        <w:t>We set up SugarAI, build custom modules where needed and set up your workflows, dashboards and reports.</w:t>
       </w:r>
     </w:p>
     <w:p>
       <w:pPr>
-        <w:pStyle w:val="Heading3"/>
+        <w:pStyle w:val="Heading4"/>
       </w:pPr>
       <w:r>
-        <w:t>6. Train, launch and support</w:t>
+        <w:t>4. Integrate and migrate</w:t>
       </w:r>
     </w:p>
     <w:p>
       <w:r>
-        <w:t>We train each user group, launch in stages so early feedback can shape the system, and stay on hand afterwards for support, fixes and improvements as your business changes.</w:t>
+        <w:t>We connect your ERP and other systems and move your existing data across, cleaned and checked.</w:t>
+      </w:r>
+    </w:p>
+    <w:p>
+      <w:pPr>
+        <w:pStyle w:val="Heading4"/>
+      </w:pPr>
+      <w:r>
+        <w:t>5. Train and go live</w:t>
+      </w:r>
+    </w:p>
+    <w:p>
+      <w:r>
+        <w:t>We train each group of users and launch, in stages if you prefer, so early feedback improves the system.</w:t>
+      </w:r>
+    </w:p>
+    <w:p>
+      <w:pPr>
+        <w:pStyle w:val="Heading4"/>
+      </w:pPr>
+      <w:r>
+        <w:t>6. Support</w:t>
+      </w:r>
+    </w:p>
+    <w:p>
+      <w:r>
+        <w:t>A dedicated support team takes over at go-live, with a single service desk and regular service reviews.</w:t>
       </w:r>
     </w:p>
     <w:p>
@@ -486,214 +541,12 @@
         <w:pStyle w:val="Heading2"/>
       </w:pPr>
       <w:r>
-        <w:t>NEW SECTION 3: What Affects CRM Cost and Timeline in the UAE</w:t>
+        <w:t>8. Our Industry Focus (flip cards: front = tagline, back = description, no links)</w:t>
       </w:r>
     </w:p>
     <w:p>
       <w:r>
-        <w:t>There is no single price for CRM software in the UAE, because no two projects are alike. These are the factors that shape your budget and schedule, so you can plan with confidence.</w:t>
-      </w:r>
-    </w:p>
-    <w:p>
-      <w:pPr>
-        <w:pStyle w:val="Heading3"/>
-      </w:pPr>
-      <w:r>
-        <w:t>Type and scope of CRM</w:t>
-      </w:r>
-    </w:p>
-    <w:p>
-      <w:r>
-        <w:t>A focused sales CRM costs less than a platform covering sales, service, marketing and reporting together. The number of users also drives licence and training costs.</w:t>
-      </w:r>
-    </w:p>
-    <w:p>
-      <w:pPr>
-        <w:pStyle w:val="Heading3"/>
-      </w:pPr>
-      <w:r>
-        <w:t>Level of customization</w:t>
-      </w:r>
-    </w:p>
-    <w:p>
-      <w:r>
-        <w:t>Standard configuration is quicker and lighter on budget. Custom modules, portals and complex workflows need more design and development time.</w:t>
-      </w:r>
-    </w:p>
-    <w:p>
-      <w:pPr>
-        <w:pStyle w:val="Heading3"/>
-      </w:pPr>
-      <w:r>
-        <w:t>Integrations</w:t>
-      </w:r>
-    </w:p>
-    <w:p>
-      <w:r>
-        <w:t>Each connected system, such as ERP, accounting or telephony, adds design and testing work. Well-planned integrations pay for themselves in saved effort.</w:t>
-      </w:r>
-    </w:p>
-    <w:p>
-      <w:pPr>
-        <w:pStyle w:val="Heading3"/>
-      </w:pPr>
-      <w:r>
-        <w:t>Data migration</w:t>
-      </w:r>
-    </w:p>
-    <w:p>
-      <w:r>
-        <w:t>Clean, well-organised data moves quickly. Old spreadsheets and duplicate records take longer to prepare.</w:t>
-      </w:r>
-    </w:p>
-    <w:p>
-      <w:pPr>
-        <w:pStyle w:val="Heading3"/>
-      </w:pPr>
-      <w:r>
-        <w:t>Deployment model</w:t>
-      </w:r>
-    </w:p>
-    <w:p>
-      <w:r>
-        <w:t>Cloud and on-premises setups have different cost profiles for hosting, security and maintenance.</w:t>
-      </w:r>
-    </w:p>
-    <w:p>
-      <w:pPr>
-        <w:pStyle w:val="Heading3"/>
-      </w:pPr>
-      <w:r>
-        <w:t>Support after launch</w:t>
-      </w:r>
-    </w:p>
-    <w:p>
-      <w:r>
-        <w:t>Ongoing support, upgrades and improvements keep the CRM useful. We agree the level you need up front.</w:t>
-      </w:r>
-    </w:p>
-    <w:p>
-      <w:r>
-        <w:t>As a rough guide, a configured cloud CRM can go live in a matter of weeks, while a project with custom modules, several integrations or a large data migration takes longer. After a short discovery call, we give you a clear estimate and timeline based on your real requirements, not a generic quote.</w:t>
-      </w:r>
-    </w:p>
-    <w:p>
-      <w:pPr>
-        <w:pStyle w:val="Heading3"/>
-      </w:pPr>
-      <w:r>
-        <w:t>How to choose a CRM partner in the UAE</w:t>
-      </w:r>
-    </w:p>
-    <w:p>
-      <w:r>
-        <w:t>Look for a partner with proven experience in your industry, and ask for examples of similar work.</w:t>
-      </w:r>
-    </w:p>
-    <w:p>
-      <w:r>
-        <w:t>Check that they can support the whole journey, from consulting to integration and support, so you are not passed between vendors.</w:t>
-      </w:r>
-    </w:p>
-    <w:p>
-      <w:r>
-        <w:t>Ask how they handle training and user adoption, because a CRM that nobody uses delivers nothing.</w:t>
-      </w:r>
-    </w:p>
-    <w:p>
-      <w:r>
-        <w:t>Make sure the team is easy to reach locally, and speaks plainly about cost and risk.</w:t>
-      </w:r>
-    </w:p>
-    <w:p>
-      <w:r>
-        <w:t>Arrange a call before you commit, and see whether they ask about your business before they talk about their product.</w:t>
-      </w:r>
-    </w:p>
-    <w:p>
-      <w:pPr>
-        <w:pStyle w:val="Heading2"/>
-      </w:pPr>
-      <w:r>
-        <w:t>Why Choose HAMT Infotech for CRM Solutions in the UAE?</w:t>
-      </w:r>
-    </w:p>
-    <w:p>
-      <w:pPr>
-        <w:pStyle w:val="Heading3"/>
-      </w:pPr>
-      <w:r>
-        <w:t>Tailored Solutions</w:t>
-      </w:r>
-    </w:p>
-    <w:p>
-      <w:r>
-        <w:t>No two businesses sell the same way. We shape the CRM around your process, so your team gets the features it will actually use and none of the clutter it will not.</w:t>
-      </w:r>
-    </w:p>
-    <w:p>
-      <w:pPr>
-        <w:pStyle w:val="Heading3"/>
-      </w:pPr>
-      <w:r>
-        <w:t>SugarCRM Partnership</w:t>
-      </w:r>
-    </w:p>
-    <w:p>
-      <w:r>
-        <w:t>As a SugarCRM partner in the UAE, we handle implementation, customization and ongoing support directly. You get a proven platform and a team that knows it inside out.</w:t>
-      </w:r>
-    </w:p>
-    <w:p>
-      <w:pPr>
-        <w:pStyle w:val="Heading3"/>
-      </w:pPr>
-      <w:r>
-        <w:t>Experienced Team</w:t>
-      </w:r>
-    </w:p>
-    <w:p>
-      <w:r>
-        <w:t>Our CRM consultants, developers and integration specialists have worked across many industries, so you get practical advice from planning through to life after launch.</w:t>
-      </w:r>
-    </w:p>
-    <w:p>
-      <w:pPr>
-        <w:pStyle w:val="Heading3"/>
-      </w:pPr>
-      <w:r>
-        <w:t>Local Support</w:t>
-      </w:r>
-    </w:p>
-    <w:p>
-      <w:r>
-        <w:t>Based in Dubai, we understand how UAE businesses operate, and we are close by when you need us.</w:t>
-      </w:r>
-    </w:p>
-    <w:p>
-      <w:pPr>
-        <w:pStyle w:val="Heading3"/>
-      </w:pPr>
-      <w:r>
-        <w:t>Clear, Honest Advice</w:t>
-      </w:r>
-    </w:p>
-    <w:p>
-      <w:r>
-        <w:t>We tell you plainly whether a configured platform or a custom build suits you, and what each will really involve.</w:t>
-      </w:r>
-    </w:p>
-    <w:p>
-      <w:pPr>
-        <w:pStyle w:val="Heading2"/>
-      </w:pPr>
-      <w:r>
-        <w:t>Our Industry Focus (flip cards)</w:t>
-      </w:r>
-    </w:p>
-    <w:p>
-      <w:r>
-        <w:t>Every industry sells and serves differently. Our CRM software in the UAE comes with industry-specific workflows, fields and reports, so you start with a system that already speaks your language. Hover over or tap a card to see how we help.</w:t>
+        <w:t>Every industry has its own sales stages, fields and reports. We begin from an industry blueprint and then fit it to your business, so your team does not start from a blank screen. Hover over or tap a card to see how it works.</w:t>
       </w:r>
     </w:p>
     <w:p>
@@ -706,7 +559,66 @@
     </w:p>
     <w:p>
       <w:r>
-        <w:t>Link quotes, orders, production updates and after-sales service with your ERP and inventory data. Sales and production work from the same numbers, and customers get accurate delivery answers.</w:t>
+        <w:t>Front: Quotes, install base and after-sales in one place</w:t>
+      </w:r>
+    </w:p>
+    <w:p>
+      <w:r>
+        <w:t>Back: Build accurate quotes from your product options, keep warranty and service history linked to the original sale, and see aftermarket revenue as clearly as new orders.</w:t>
+      </w:r>
+    </w:p>
+    <w:p>
+      <w:pPr>
+        <w:pStyle w:val="Heading3"/>
+      </w:pPr>
+      <w:r>
+        <w:t>Distribution</w:t>
+      </w:r>
+    </w:p>
+    <w:p>
+      <w:r>
+        <w:t>Front: Territory, margin and live stock in one view</w:t>
+      </w:r>
+    </w:p>
+    <w:p>
+      <w:r>
+        <w:t>Back: Quote from real stock levels in your ERP, apply discount limits before a quote goes out, and see results by brand, territory and salesperson without waiting for month-end.</w:t>
+      </w:r>
+    </w:p>
+    <w:p>
+      <w:pPr>
+        <w:pStyle w:val="Heading3"/>
+      </w:pPr>
+      <w:r>
+        <w:t>Retail &amp; Auto Parts</w:t>
+      </w:r>
+    </w:p>
+    <w:p>
+      <w:r>
+        <w:t>Front: From workshop RFQ to retail counter sale</w:t>
+      </w:r>
+    </w:p>
+    <w:p>
+      <w:r>
+        <w:t>Back: Part numbers, prices and stock stay on one customer record, so quotes are quick and accurate. Warranty claims and repeat purchases stay linked to the original sale across channels.</w:t>
+      </w:r>
+    </w:p>
+    <w:p>
+      <w:pPr>
+        <w:pStyle w:val="Heading3"/>
+      </w:pPr>
+      <w:r>
+        <w:t>Field Service Management</w:t>
+      </w:r>
+    </w:p>
+    <w:p>
+      <w:r>
+        <w:t>Front: From service request to signed job card</w:t>
+      </w:r>
+    </w:p>
+    <w:p>
+      <w:r>
+        <w:t>Back: Schedule engineers by skill, location and SLA. They get job details, asset history and checklists on their phone, and capture parts, photos and the customer signature on site.</w:t>
       </w:r>
     </w:p>
     <w:p>
@@ -719,7 +631,102 @@
     </w:p>
     <w:p>
       <w:r>
-        <w:t>Track listings, enquiries, viewings and offers in one place. Automated follow-ups and clear pipelines help agents move buyers and investors from first call to closing faster.</w:t>
+        <w:t>Front: Portal leads to handover, in one record</w:t>
+      </w:r>
+    </w:p>
+    <w:p>
+      <w:r>
+        <w:t>Back: Enquiries from Bayut, Property Finder and your website reach the right agent within seconds, in the right language. Track units, bookings and broker commission through payment plan, handover and snagging.</w:t>
+      </w:r>
+    </w:p>
+    <w:p>
+      <w:pPr>
+        <w:pStyle w:val="Heading3"/>
+      </w:pPr>
+      <w:r>
+        <w:t>Commercial Banking</w:t>
+      </w:r>
+    </w:p>
+    <w:p>
+      <w:r>
+        <w:t>Front: One view of the relationship, on your own infrastructure</w:t>
+      </w:r>
+    </w:p>
+    <w:p>
+      <w:r>
+        <w:t>Back: See each customer group across its entities, facilities and relationship managers. Track credit pipelines, KYC renewals and reviews as scheduled work, hosted in your own environment where regulators require.</w:t>
+      </w:r>
+    </w:p>
+    <w:p>
+      <w:pPr>
+        <w:pStyle w:val="Heading3"/>
+      </w:pPr>
+      <w:r>
+        <w:t>Insurance</w:t>
+      </w:r>
+    </w:p>
+    <w:p>
+      <w:r>
+        <w:t>Front: Renewals that start early, brokers you can measure</w:t>
+      </w:r>
+    </w:p>
+    <w:p>
+      <w:r>
+        <w:t>Back: Open renewal pipelines ninety days ahead instead of nine, compare broker and agent performance by line of business, and let the servicing team see claim status without calling the back office.</w:t>
+      </w:r>
+    </w:p>
+    <w:p>
+      <w:pPr>
+        <w:pStyle w:val="Heading3"/>
+      </w:pPr>
+      <w:r>
+        <w:t>Telecom</w:t>
+      </w:r>
+    </w:p>
+    <w:p>
+      <w:r>
+        <w:t>Front: Enterprise accounts, sites and SLAs</w:t>
+      </w:r>
+    </w:p>
+    <w:p>
+      <w:r>
+        <w:t>Back: Manage corporate accounts with real hierarchies and service at site level, quote multi-site contracts quickly and track tickets against agreed SLAs. Renewal risk shows before the contract date.</w:t>
+      </w:r>
+    </w:p>
+    <w:p>
+      <w:pPr>
+        <w:pStyle w:val="Heading3"/>
+      </w:pPr>
+      <w:r>
+        <w:t>Pharma</w:t>
+      </w:r>
+    </w:p>
+    <w:p>
+      <w:r>
+        <w:t>Front: Structured engagement and tender discipline</w:t>
+      </w:r>
+    </w:p>
+    <w:p>
+      <w:r>
+        <w:t>Back: Plan and record engagement with healthcare professionals, with consent captured at the point of contact. Track sample accountability and run GCC tenders as a managed pipeline with document control.</w:t>
+      </w:r>
+    </w:p>
+    <w:p>
+      <w:pPr>
+        <w:pStyle w:val="Heading3"/>
+      </w:pPr>
+      <w:r>
+        <w:t>NGO &amp; Foundations</w:t>
+      </w:r>
+    </w:p>
+    <w:p>
+      <w:r>
+        <w:t>Front: Donors, grants and reporting</w:t>
+      </w:r>
+    </w:p>
+    <w:p>
+      <w:r>
+        <w:t>Back: Track donors, pledges and recurring giving, manage grant applications and milestones, coordinate volunteers and produce the reports trustees and funders expect at year end.</w:t>
       </w:r>
     </w:p>
     <w:p>
@@ -732,7 +739,12 @@
     </w:p>
     <w:p>
       <w:r>
-        <w:t>Build guest profiles, manage bookings and group enquiries, and run loyalty and feedback campaigns. Know your guests well enough to bring them back.</w:t>
+        <w:t>Front: Guest history and corporate accounts, in one record</w:t>
+      </w:r>
+    </w:p>
+    <w:p>
+      <w:r>
+        <w:t>Back: Corporate accounts, event and group bookings and repeat-guest history sit beside your property management system. Returning guests are recognised, and preferences follow them across properties.</w:t>
       </w:r>
     </w:p>
     <w:p>
@@ -740,12 +752,25 @@
         <w:pStyle w:val="Heading3"/>
       </w:pPr>
       <w:r>
-        <w:t>Retail &amp; E-Commerce</w:t>
+        <w:t>Logistics</w:t>
       </w:r>
     </w:p>
     <w:p>
       <w:r>
-        <w:t>See purchase history and buying behaviour in one profile, then run targeted offers, win-back campaigns and loyalty programmes that raise repeat sales.</w:t>
+        <w:t>Front: Quotes, shipments and tracking in one view</w:t>
+      </w:r>
+    </w:p>
+    <w:p>
+      <w:r>
+        <w:t>Back: Freight rates, bookings and container status sit against the customer account, so sales and operations see the same picture. Recurring lanes, contract rates and SLA performance show by customer, trade lane and mode.</w:t>
+      </w:r>
+    </w:p>
+    <w:p>
+      <w:pPr>
+        <w:pStyle w:val="Heading2"/>
+      </w:pPr>
+      <w:r>
+        <w:t>9. Why Choose HAMT Infotech for CRM Solutions in the UAE?</w:t>
       </w:r>
     </w:p>
     <w:p>
@@ -753,12 +778,12 @@
         <w:pStyle w:val="Heading3"/>
       </w:pPr>
       <w:r>
-        <w:t>Logistics &amp; Transportation</w:t>
+        <w:t>26 Years in the UAE and GCC</w:t>
       </w:r>
     </w:p>
     <w:p>
       <w:r>
-        <w:t>Keep shipment enquiries, quotes, customer updates and service issues visible to every team, so delays are handled before they turn into complaints.</w:t>
+        <w:t>We have worked with businesses across the region for 26 years, as advisors who understand how they operate and as engineers who build the systems they run on.</w:t>
       </w:r>
     </w:p>
     <w:p>
@@ -766,12 +791,12 @@
         <w:pStyle w:val="Heading3"/>
       </w:pPr>
       <w:r>
-        <w:t>Financial Services</w:t>
+        <w:t>One Team for the Whole CRM</w:t>
       </w:r>
     </w:p>
     <w:p>
       <w:r>
-        <w:t>Manage client portfolios, onboarding, renewals and follow-ups with workflows that support compliance. Give clients timely, personal advice backed by a full history.</w:t>
+        <w:t>Discovery, design, configuration, development, data migration, ERP integration, training and support all come from one team, so you have one point of accountability.</w:t>
       </w:r>
     </w:p>
     <w:p>
@@ -779,12 +804,12 @@
         <w:pStyle w:val="Heading3"/>
       </w:pPr>
       <w:r>
-        <w:t>Healthcare</w:t>
+        <w:t>SugarAI Expertise</w:t>
       </w:r>
     </w:p>
     <w:p>
       <w:r>
-        <w:t>Handle appointments, patient follow-ups and department coordination securely. Give patients a smoother experience and staff a clear view of every case.</w:t>
+        <w:t>We work with SugarAI every day, including its AI features, and we know where to stay close to standard and where a custom build is worth it.</w:t>
       </w:r>
     </w:p>
     <w:p>
@@ -792,12 +817,12 @@
         <w:pStyle w:val="Heading3"/>
       </w:pPr>
       <w:r>
-        <w:t>Education</w:t>
+        <w:t>Support After Go-Live</w:t>
       </w:r>
     </w:p>
     <w:p>
       <w:r>
-        <w:t>Manage prospective student enquiries, admission stages, counsellor follow-ups and parent communication from first contact through to enrolment.</w:t>
+        <w:t>A dedicated support team takes over at launch and works to the service levels in your contract, with a single service desk and regular reviews.</w:t>
       </w:r>
     </w:p>
     <w:p>
@@ -805,12 +830,20 @@
         <w:pStyle w:val="Heading3"/>
       </w:pPr>
       <w:r>
-        <w:t>Construction &amp; Contracting</w:t>
+        <w:t>Clear Scope and Timelines</w:t>
       </w:r>
     </w:p>
     <w:p>
       <w:r>
-        <w:t>Track tenders, project stakeholders, quotes, variations and approvals, so opportunities and client commitments are never missed.</w:t>
+        <w:t>Scope and timelines are agreed before work starts, and a named engagement lead stays with you from kickoff to go-live.</w:t>
+      </w:r>
+    </w:p>
+    <w:p>
+      <w:pPr>
+        <w:pStyle w:val="Heading2"/>
+      </w:pPr>
+      <w:r>
+        <w:t>10. NEW SECTION: CRM Solutions UAE: Frequently Asked Questions</w:t>
       </w:r>
     </w:p>
     <w:p>
@@ -818,12 +851,12 @@
         <w:pStyle w:val="Heading3"/>
       </w:pPr>
       <w:r>
-        <w:t>Automotive</w:t>
+        <w:t>What is a CRM, and why does a UAE business need one?</w:t>
       </w:r>
     </w:p>
     <w:p>
       <w:r>
-        <w:t>Follow leads from enquiry to test drive to delivery. Keep service reminders, warranty follow-ups and customer feedback on schedule.</w:t>
+        <w:t>A CRM is software that keeps every customer interaction in one place, from the first enquiry to renewal and support. It helps your team follow up on time, see the full history of each customer and report on sales without spreadsheets. For UAE companies with many leads, channels and languages, it keeps everyone working from the same information.</w:t>
       </w:r>
     </w:p>
     <w:p>
@@ -831,12 +864,12 @@
         <w:pStyle w:val="Heading3"/>
       </w:pPr>
       <w:r>
-        <w:t>Professional Services</w:t>
+        <w:t>What is the difference between CRM software, CRM services and a CRM solution?</w:t>
       </w:r>
     </w:p>
     <w:p>
       <w:r>
-        <w:t>Manage proposals, client engagements, renewals and account health. Partners see the pipeline, and teams see what each client needs next.</w:t>
+        <w:t>CRM software is the platform itself. CRM services are the work around it, such as consulting, implementation, customization, integration and support. A CRM solution is the finished result: the right software, set up, connected and supported to fit your business. HAMT Infotech provides all three.</w:t>
       </w:r>
     </w:p>
     <w:p>
@@ -844,20 +877,12 @@
         <w:pStyle w:val="Heading3"/>
       </w:pPr>
       <w:r>
-        <w:t>Telecom &amp; IT Services</w:t>
+        <w:t>What is SugarAI, and how is it different from Sugar CRM?</w:t>
       </w:r>
     </w:p>
     <w:p>
       <w:r>
-        <w:t>Handle contracts, renewals, upsell opportunities and support cases for customers who expect fast, accurate service across every channel.</w:t>
-      </w:r>
-    </w:p>
-    <w:p>
-      <w:pPr>
-        <w:pStyle w:val="Heading2"/>
-      </w:pPr>
-      <w:r>
-        <w:t>NEW SECTION 4: CRM Solutions UAE: Frequently Asked Questions</w:t>
+        <w:t>SugarAI is the intelligent evolution of Sugar CRM. It keeps the sales, service and marketing platform and adds built-in predictive AI that scores leads, flags at-risk deals and drafts account summaries automatically.</w:t>
       </w:r>
     </w:p>
     <w:p>
@@ -865,12 +890,12 @@
         <w:pStyle w:val="Heading3"/>
       </w:pPr>
       <w:r>
-        <w:t>What is a CRM and why does my UAE business need one?</w:t>
+        <w:t>How quickly can we go live?</w:t>
       </w:r>
     </w:p>
     <w:p>
       <w:r>
-        <w:t>A CRM is software that stores every customer interaction in one place, from the first enquiry to renewals and support. It helps your team follow up on time, see the full history of each customer and report on sales without spreadsheets. For UAE companies handling many leads, channels and languages, it keeps everyone working from the same information.</w:t>
+        <w:t>With Guided Low-Touch onboarding, we provision a working system on day one and teams can go live within days. Larger programmes with ERP integration and several entities follow a phased plan, with timelines agreed before work starts.</w:t>
       </w:r>
     </w:p>
     <w:p>
@@ -878,12 +903,12 @@
         <w:pStyle w:val="Heading3"/>
       </w:pPr>
       <w:r>
-        <w:t>What is the difference between CRM software, CRM services and CRM solutions?</w:t>
+        <w:t>Can SugarAI work if our customer data is incomplete?</w:t>
       </w:r>
     </w:p>
     <w:p>
       <w:r>
-        <w:t>CRM software is the platform itself, such as SugarCRM. CRM services are the work around it: consulting, implementation, customization, integration and support. A CRM solution is the complete result, the right software set up, connected and supported to fit your business. At HAMT Infotech we provide all three.</w:t>
+        <w:t>Yes. SugarAI is built to give useful predictions from partial or ageing records, so you do not need a perfect database before you start. Data improves as your team uses the system.</w:t>
       </w:r>
     </w:p>
     <w:p>
@@ -891,51 +916,12 @@
         <w:pStyle w:val="Heading3"/>
       </w:pPr>
       <w:r>
-        <w:t>How much do CRM solutions in the UAE cost?</w:t>
+        <w:t>Can you connect the CRM to our ERP and other systems?</w:t>
       </w:r>
     </w:p>
     <w:p>
       <w:r>
-        <w:t>Cost depends on the platform, the number of users, how much customization you need, which systems must be integrated and how much data must be migrated. A configured cloud CRM costs far less than a fully custom build. After a short discovery call we give you a clear estimate based on your actual requirements.</w:t>
-      </w:r>
-    </w:p>
-    <w:p>
-      <w:pPr>
-        <w:pStyle w:val="Heading3"/>
-      </w:pPr>
-      <w:r>
-        <w:t>How long does a CRM implementation take?</w:t>
-      </w:r>
-    </w:p>
-    <w:p>
-      <w:r>
-        <w:t>A standard cloud CRM can often be live within a few weeks. Projects with custom modules, several integrations or large data migrations take longer. We agree a timeline during planning and deliver in stages, so your team can start using key features early.</w:t>
-      </w:r>
-    </w:p>
-    <w:p>
-      <w:pPr>
-        <w:pStyle w:val="Heading3"/>
-      </w:pPr>
-      <w:r>
-        <w:t>Should we choose a custom CRM or a ready-made CRM like SugarCRM?</w:t>
-      </w:r>
-    </w:p>
-    <w:p>
-      <w:r>
-        <w:t>If your processes are fairly standard, a configured platform is usually faster and more economical. If you have unique workflows, pricing rules or industry data, custom development on top of a platform gives you the best of both. We will tell you honestly which route suits you.</w:t>
-      </w:r>
-    </w:p>
-    <w:p>
-      <w:pPr>
-        <w:pStyle w:val="Heading3"/>
-      </w:pPr>
-      <w:r>
-        <w:t>Can you connect the CRM to our ERP, accounting and other systems?</w:t>
-      </w:r>
-    </w:p>
-    <w:p>
-      <w:r>
-        <w:t>Yes. CRM integration is a core part of our work. We connect the CRM with ERP and accounting tools, your website and forms, email and calendar, telephony and messaging platforms, so data moves between systems automatically.</w:t>
+        <w:t>Yes. CRM integration is a core part of our work. We connect SugarAI with ERP and finance platforms, your website, email and marketing tools, so quotes, orders and customer details move between systems automatically.</w:t>
       </w:r>
     </w:p>
     <w:p>
@@ -948,7 +934,7 @@
     </w:p>
     <w:p>
       <w:r>
-        <w:t>Yes. We review, clean and map your existing data, then migrate it in stages and check the results with your team. This avoids duplicates and gaps, and lets you start with a clean, trusted database.</w:t>
+        <w:t>Yes. We clean your data, map it to the new structure and carry across the history that matters. Migration is planned so your teams keep working with minimal disruption.</w:t>
       </w:r>
     </w:p>
     <w:p>
@@ -956,12 +942,12 @@
         <w:pStyle w:val="Heading3"/>
       </w:pPr>
       <w:r>
-        <w:t>Is cloud or on-premises CRM better for us?</w:t>
+        <w:t>Can the CRM be customised for our industry?</w:t>
       </w:r>
     </w:p>
     <w:p>
       <w:r>
-        <w:t>Cloud CRM is usually faster to launch, easier to scale and free of hardware upkeep. On-premises CRM suits organisations that need full control over infrastructure and data location. We compare both against your security, budget and growth plans before you decide.</w:t>
+        <w:t>Yes. We start from an industry blueprint with the fields, stages, reports and integrations your sector needs, then fit it to your business. Where your process is unusual, we build custom fields, modules and plugins inside SugarAI.</w:t>
       </w:r>
     </w:p>
     <w:p>
@@ -969,12 +955,12 @@
         <w:pStyle w:val="Heading3"/>
       </w:pPr>
       <w:r>
-        <w:t>What does SugarAI add to SugarCRM?</w:t>
+        <w:t>Is cloud or on-premises better for us?</w:t>
       </w:r>
     </w:p>
     <w:p>
       <w:r>
-        <w:t>SugarAI features help your team work smarter, with predictive lead scoring, forecasting support and summaries that reduce manual note taking. We enable them where they help and train your users to get value from them.</w:t>
+        <w:t>Cloud is usually quicker to launch and needs no hardware. On-premises, or a private cloud, suits organisations that must keep data in their own environment, such as banks. We compare both against your regulatory and growth needs before you decide.</w:t>
       </w:r>
     </w:p>
     <w:p>
@@ -982,17 +968,17 @@
         <w:pStyle w:val="Heading3"/>
       </w:pPr>
       <w:r>
-        <w:t>Do you support us after the CRM goes live?</w:t>
+        <w:t>Do you support us after go-live?</w:t>
       </w:r>
     </w:p>
     <w:p>
       <w:r>
-        <w:t>Yes. We offer training, user support, upgrades and continuous improvement, so the CRM keeps pace as your business changes. Many clients start with a core setup and add modules over time.</w:t>
+        <w:t>Yes. A dedicated support team takes over at go-live and works to the service levels in your contract. Requests go through a single service desk and are reviewed with you regularly.</w:t>
       </w:r>
     </w:p>
     <w:p>
       <w:r>
-        <w:t>Unchanged sections: Get a Call Back form, Connect with Expert, Insights, footer.</w:t>
+        <w:t>Unchanged: Get a Call Back forms, Connect with Expert, Insights, footer.</w:t>
       </w:r>
     </w:p>
     <w:sectPr>

</xml_diff>

<commit_message>
Replace SugarAI module section with general CRM types and ready-made vs custom
Co-Authored-By: Claude Sonnet 5.5 <noreply@anthropic.com>
Claude-Session: https://claude.ai/code/session_01EvNjF6Z24XTpLixWRFRe99
</commit_message>
<xml_diff>
--- a/crm-page/crm-solutions-uae-content.docx
+++ b/crm-page/crm-solutions-uae-content.docx
@@ -255,12 +255,12 @@
         <w:pStyle w:val="Heading2"/>
       </w:pPr>
       <w:r>
-        <w:t>5. NEW SECTION: SugarAI: The CRM Platform We Build On</w:t>
+        <w:t>5. NEW SECTION: Types of CRM, and Which One Fits Your Business</w:t>
       </w:r>
     </w:p>
     <w:p>
       <w:r>
-        <w:t>SugarAI is the intelligent evolution of Sugar CRM, the platform thousands of businesses use for sales, service and marketing. It adds built-in predictive AI for every user, and it runs on the cloud or on your own servers, so you can meet UAE and GCC data residency needs.</w:t>
+        <w:t>CRM is not one-size-fits-all. The right setup depends on how you sell, how you serve customers and how far your process differs from the standard. Here is how to think about it.</w:t>
       </w:r>
     </w:p>
     <w:p>
@@ -268,7 +268,7 @@
         <w:pStyle w:val="Heading3"/>
       </w:pPr>
       <w:r>
-        <w:t>Three modules, one platform</w:t>
+        <w:t>Three types of CRM</w:t>
       </w:r>
     </w:p>
     <w:p>
@@ -276,17 +276,17 @@
         <w:pStyle w:val="Heading4"/>
       </w:pPr>
       <w:r>
-        <w:t>SugarAI Sell</w:t>
+        <w:t>Operational CRM</w:t>
       </w:r>
     </w:p>
     <w:p>
       <w:r>
-        <w:t>Helps reps focus on the right accounts at the right moment. They see which deals are gaining momentum and which are stalling, and built-in forecasting shows what is most likely to close.</w:t>
+        <w:t>Handles the daily work of sales, service and marketing. Leads, follow-ups, quotes and cases are captured and automated, so every customer interaction gets attention.</w:t>
       </w:r>
     </w:p>
     <w:p>
       <w:r>
-        <w:t>Key functions: Pipeline tracking and forecasting, AI deal scoring, Next-best-action guidance, Ready-made ERP integrations</w:t>
+        <w:t>Key functions: Lead and contact management, Follow-up automation, Case handling</w:t>
       </w:r>
     </w:p>
     <w:p>
@@ -294,17 +294,17 @@
         <w:pStyle w:val="Heading4"/>
       </w:pPr>
       <w:r>
-        <w:t>SugarAI Serve</w:t>
+        <w:t>Analytical CRM</w:t>
       </w:r>
     </w:p>
     <w:p>
       <w:r>
-        <w:t>Keeps every case, channel and customer history in one console. Whether a customer writes, chats, calls or uses self-service, the agent sees the whole story in one thread.</w:t>
+        <w:t>Turns customer data into insight. Dashboards and reports show buying patterns, campaign results and sales performance, so managers plan with facts.</w:t>
       </w:r>
     </w:p>
     <w:p>
       <w:r>
-        <w:t>Key functions: Omnichannel case management, SLA and escalation tracking, Knowledge base integration, At-risk account alerts</w:t>
+        <w:t>Key functions: Sales dashboards, Customer segmentation, Forecast reports</w:t>
       </w:r>
     </w:p>
     <w:p>
@@ -312,17 +312,17 @@
         <w:pStyle w:val="Heading4"/>
       </w:pPr>
       <w:r>
-        <w:t>SugarAI Market</w:t>
+        <w:t>Collaborative CRM</w:t>
       </w:r>
     </w:p>
     <w:p>
       <w:r>
-        <w:t>Lets you build personalised campaigns without code. Emails, landing pages and nurture journeys run from one place, and lead scoring points sales to prospects ready to talk.</w:t>
+        <w:t>Shares customer information across sales, service, marketing and even partners, so everyone speaks to the customer with the same up-to-date picture.</w:t>
       </w:r>
     </w:p>
     <w:p>
       <w:r>
-        <w:t>Key functions: No-code campaign builder, Multi-channel personalisation, Lead scoring and nurture tracks, Full-journey attribution</w:t>
+        <w:t>Key functions: Shared customer records, Cross-team hand-offs, Partner and portal access</w:t>
       </w:r>
     </w:p>
     <w:p>
@@ -330,7 +330,7 @@
         <w:pStyle w:val="Heading3"/>
       </w:pPr>
       <w:r>
-        <w:t>What the AI layer does for your team</w:t>
+        <w:t>Ready-made or custom CRM?</w:t>
       </w:r>
     </w:p>
     <w:p>
@@ -338,12 +338,12 @@
         <w:pStyle w:val="Heading4"/>
       </w:pPr>
       <w:r>
-        <w:t>It predicts</w:t>
+        <w:t>Configured, Ready-Made CRM</w:t>
       </w:r>
     </w:p>
     <w:p>
       <w:r>
-        <w:t>Scores every lead, opportunity and account, flags deals that are losing momentum and forecasts what will close.</w:t>
+        <w:t>A proven platform can go live quickly. We set up fields, workflows and dashboards, migrate your data and train your team. It suits businesses whose sales and service steps are fairly standard.</w:t>
       </w:r>
     </w:p>
     <w:p>
@@ -351,30 +351,17 @@
         <w:pStyle w:val="Heading4"/>
       </w:pPr>
       <w:r>
-        <w:t>It summarises</w:t>
+        <w:t>Custom CRM</w:t>
       </w:r>
     </w:p>
     <w:p>
       <w:r>
-        <w:t>Drafts account summaries and meeting prep automatically, so reps stop piecing together context by hand.</w:t>
-      </w:r>
-    </w:p>
-    <w:p>
-      <w:pPr>
-        <w:pStyle w:val="Heading4"/>
-      </w:pPr>
-      <w:r>
-        <w:t>It guides</w:t>
+        <w:t>When your pricing, approvals or compliance steps do not fit a standard screen, we build custom modules, fields and portals on top of the platform. You keep a reliable core and add what is unique to your business.</w:t>
       </w:r>
     </w:p>
     <w:p>
       <w:r>
-        <w:t>Suggests the next best action for each rep, so the CRM behaves like a coach and not an archive.</w:t>
-      </w:r>
-    </w:p>
-    <w:p>
-      <w:r>
-        <w:t>SugarAI is built to work with incomplete data. Most CRM records are partial or ageing, so you get useful predictions from day one and do not have to wait for a perfect database.</w:t>
+        <w:t>Whichever route you choose, we build on SugarAI, which adds built-in AI to score leads, flag at-risk deals and draft account summaries. It works even when your CRM records are incomplete, so you get useful predictions from day one.</w:t>
       </w:r>
     </w:p>
     <w:p>
@@ -434,7 +421,7 @@
     </w:p>
     <w:p>
       <w:r>
-        <w:t>Use the best practices already built into SugarAI instead of a long services project. We provision a working system on day one and give you a dedicated Onboarding Advisor. Your team learns the system as it goes live, so ownership comes naturally. Training paths from Sugar University and Sugar Club keep the learning going.</w:t>
+        <w:t>Use the best practices already built into SugarAI instead of a long services project. We provision a working system on day one and give you a dedicated Onboarding Advisor. Your team learns the system as it goes live, so ownership comes naturally.</w:t>
       </w:r>
     </w:p>
     <w:p>

</xml_diff>

<commit_message>
Add CRM reimplementation section and FAQ; update offerings card
Co-Authored-By: Claude Sonnet 5.5 <noreply@anthropic.com>
Claude-Session: https://claude.ai/code/session_01EvNjF6Z24XTpLixWRFRe99
</commit_message>
<xml_diff>
--- a/crm-page/crm-solutions-uae-content.docx
+++ b/crm-page/crm-solutions-uae-content.docx
@@ -143,12 +143,12 @@
         <w:pStyle w:val="Heading3"/>
       </w:pPr>
       <w:r>
-        <w:t>CRM Migration &amp; Optimisation</w:t>
+        <w:t>CRM Reimplementation &amp; Migration</w:t>
       </w:r>
     </w:p>
     <w:p>
       <w:r>
-        <w:t>Moving from a legacy CRM or spreadsheets? We clean and map your data and carry across the history that matters. Already on SugarAI? CRM customization and tuning of your workflows and reports helps the system work harder for you.</w:t>
+        <w:t>Already have a CRM that your team works around? We find what went wrong, reset the foundations and relaunch it properly. Moving from a legacy CRM or spreadsheets? We clean and map your data and carry across the history that matters.</w:t>
       </w:r>
     </w:p>
     <w:p>
@@ -369,7 +369,128 @@
         <w:pStyle w:val="Heading2"/>
       </w:pPr>
       <w:r>
-        <w:t>6. CRM Deployment Options</w:t>
+        <w:t>6. NEW SECTION: CRM Reimplementation: Fix the CRM You Already Own</w:t>
+      </w:r>
+    </w:p>
+    <w:p>
+      <w:r>
+        <w:t>Many companies we meet already have a CRM. It was bought with good intentions, but today the team works around it, nobody trusts the data and reports are rebuilt in spreadsheets. In most cases the software is not the problem. The way it was set up is. CRM reimplementation resets the foundations without throwing away what already works.</w:t>
+      </w:r>
+    </w:p>
+    <w:p>
+      <w:pPr>
+        <w:pStyle w:val="Heading3"/>
+      </w:pPr>
+      <w:r>
+        <w:t>Signs it is time to reimplement</w:t>
+      </w:r>
+    </w:p>
+    <w:p>
+      <w:r>
+        <w:t>Your team avoids the CRM, or updates it days after the event.</w:t>
+      </w:r>
+    </w:p>
+    <w:p>
+      <w:r>
+        <w:t>Two reports show two different numbers, so nobody trusts either.</w:t>
+      </w:r>
+    </w:p>
+    <w:p>
+      <w:r>
+        <w:t>The CRM no longer matches how you sell or serve after growth, new products or a new structure.</w:t>
+      </w:r>
+    </w:p>
+    <w:p>
+      <w:r>
+        <w:t>Staff keep private spreadsheets as a backup.</w:t>
+      </w:r>
+    </w:p>
+    <w:p>
+      <w:r>
+        <w:t>Duplicate, outdated or missing records slow everyone down.</w:t>
+      </w:r>
+    </w:p>
+    <w:p>
+      <w:r>
+        <w:t>Adding a user, team or branch has become slow and painful.</w:t>
+      </w:r>
+    </w:p>
+    <w:p>
+      <w:r>
+        <w:t>Your ERP, email or finance system is not connected to the CRM.</w:t>
+      </w:r>
+    </w:p>
+    <w:p>
+      <w:pPr>
+        <w:pStyle w:val="Heading3"/>
+      </w:pPr>
+      <w:r>
+        <w:t>How we reimplement your CRM</w:t>
+      </w:r>
+    </w:p>
+    <w:p>
+      <w:pPr>
+        <w:pStyle w:val="Heading4"/>
+      </w:pPr>
+      <w:r>
+        <w:t>1. Health check</w:t>
+      </w:r>
+    </w:p>
+    <w:p>
+      <w:r>
+        <w:t>We review how the CRM is really used: data quality, workflows, user roles, reports, integrations and licences. We also talk to the people who use it every day, because they know exactly where it hurts.</w:t>
+      </w:r>
+    </w:p>
+    <w:p>
+      <w:pPr>
+        <w:pStyle w:val="Heading4"/>
+      </w:pPr>
+      <w:r>
+        <w:t>2. Reset and rebuild</w:t>
+      </w:r>
+    </w:p>
+    <w:p>
+      <w:r>
+        <w:t>Together we decide what to keep, fix and remove. Then we redesign workflows, clean and restructure data, rebuild screens and reports, and reconnect your other systems. Where it makes sense, we move you to a better-suited setup.</w:t>
+      </w:r>
+    </w:p>
+    <w:p>
+      <w:pPr>
+        <w:pStyle w:val="Heading4"/>
+      </w:pPr>
+      <w:r>
+        <w:t>3. Relaunch with adoption in mind</w:t>
+      </w:r>
+    </w:p>
+    <w:p>
+      <w:r>
+        <w:t>We train users by role, relaunch in stages and watch usage closely in the first weeks. Dashboards show whether the CRM is finally being used, and we adjust quickly where it is not.</w:t>
+      </w:r>
+    </w:p>
+    <w:p>
+      <w:pPr>
+        <w:pStyle w:val="Heading4"/>
+      </w:pPr>
+      <w:r>
+        <w:t>4. Build on the new foundation</w:t>
+      </w:r>
+    </w:p>
+    <w:p>
+      <w:r>
+        <w:t>Once the basics are stable, we add custom modules, dashboards and automation, so the CRM keeps growing with your business instead of falling behind it again.</w:t>
+      </w:r>
+    </w:p>
+    <w:p>
+      <w:r>
+        <w:t>A CRM works when both processes and people are considered. That is why every reimplementation includes change management: a clear owner on your side, role-based training and quick feedback loops, so your team uses the CRM because it helps them.</w:t>
+      </w:r>
+    </w:p>
+    <w:p>
+      <w:pPr>
+        <w:pStyle w:val="Heading2"/>
+      </w:pPr>
+      <w:r>
+        <w:t>7. CRM Deployment Options</w:t>
       </w:r>
     </w:p>
     <w:p>
@@ -403,7 +524,7 @@
         <w:pStyle w:val="Heading2"/>
       </w:pPr>
       <w:r>
-        <w:t>7. NEW SECTION: How We Deliver Your CRM</w:t>
+        <w:t>8. NEW SECTION: How We Deliver Your CRM</w:t>
       </w:r>
     </w:p>
     <w:p>
@@ -528,7 +649,7 @@
         <w:pStyle w:val="Heading2"/>
       </w:pPr>
       <w:r>
-        <w:t>8. Our Industry Focus (flip cards: front = tagline, back = description, no links)</w:t>
+        <w:t>9. Our Industry Focus (flip cards: front = tagline, back = description, no links)</w:t>
       </w:r>
     </w:p>
     <w:p>
@@ -757,7 +878,7 @@
         <w:pStyle w:val="Heading2"/>
       </w:pPr>
       <w:r>
-        <w:t>9. Why Choose HAMT Infotech for CRM Solutions in the UAE?</w:t>
+        <w:t>10. Why Choose HAMT Infotech for CRM Solutions in the UAE?</w:t>
       </w:r>
     </w:p>
     <w:p>
@@ -830,7 +951,7 @@
         <w:pStyle w:val="Heading2"/>
       </w:pPr>
       <w:r>
-        <w:t>10. NEW SECTION: CRM Solutions UAE: Frequently Asked Questions</w:t>
+        <w:t>11. NEW SECTION: CRM Solutions UAE: Frequently Asked Questions</w:t>
       </w:r>
     </w:p>
     <w:p>
@@ -857,6 +978,19 @@
     <w:p>
       <w:r>
         <w:t>CRM software is the platform itself. CRM services are the work around it, such as consulting, implementation, customization, integration and support. A CRM solution is the finished result: the right software, set up, connected and supported to fit your business. HAMT Infotech provides all three.</w:t>
+      </w:r>
+    </w:p>
+    <w:p>
+      <w:pPr>
+        <w:pStyle w:val="Heading3"/>
+      </w:pPr>
+      <w:r>
+        <w:t>When should we reimplement our current CRM?</w:t>
+      </w:r>
+    </w:p>
+    <w:p>
+      <w:r>
+        <w:t>Consider it when your team avoids the CRM, data is inconsistent, reports cannot be trusted, or the system no longer fits how you work or grow. We start with a health check to find what is really wrong. Often the platform is fine and the setup needs resetting, so you keep your investment and fix the foundations.</w:t>
       </w:r>
     </w:p>
     <w:p>

</xml_diff>

<commit_message>
Add four mid-page CTA bands to the CRM page and doc
Co-Authored-By: Claude Sonnet 5.5 <noreply@anthropic.com>
Claude-Session: https://claude.ai/code/session_01EvNjF6Z24XTpLixWRFRe99
</commit_message>
<xml_diff>
--- a/crm-page/crm-solutions-uae-content.docx
+++ b/crm-page/crm-solutions-uae-content.docx
@@ -21,7 +21,7 @@
           <w:color w:val="5B6773"/>
           <w:sz w:val="18"/>
         </w:rPr>
-        <w:t>Final page copy for https://hamtinfotech.com/solutions/crm/, in the Insurance sub-page format, which is the standard Word format. The page keeps the existing HAMT Infotech CRM template and section blocks. Copy is rewritten for the user journey, with new sections for CRM types, reimplementation and delivery added where they fit the flow.</w:t>
+        <w:t>Final page copy for https://hamtinfotech.com/solutions/crm/, in the Insurance sub-page format, which is the standard Word format. The page keeps the existing HAMT Infotech CRM template and section blocks. Copy is rewritten for the user journey, with new sections for CRM types, reimplementation and delivery added where they fit the flow, and four mid-page CTAs placed at decision points.</w:t>
       </w:r>
     </w:p>
     <w:p>
@@ -1925,7 +1925,99 @@
         <w:keepNext/>
       </w:pPr>
       <w:r>
-        <w:t>5. Types of CRM and Ready-Made vs Custom</w:t>
+        <w:t>5. Mid-page CTA 1</w:t>
+      </w:r>
+    </w:p>
+    <w:p>
+      <w:pPr>
+        <w:pStyle w:val="ListParagraph"/>
+        <w:numPr>
+          <w:ilvl w:val="0"/>
+          <w:numId w:val="2"/>
+        </w:numPr>
+        <w:spacing w:after="120"/>
+        <w:jc w:val="both"/>
+      </w:pPr>
+      <w:r>
+        <w:rPr>
+          <w:b/>
+          <w:color w:val="0A1F33"/>
+          <w:sz w:val="20"/>
+        </w:rPr>
+        <w:t xml:space="preserve">H2: </w:t>
+      </w:r>
+      <w:r>
+        <w:rPr>
+          <w:color w:val="0A1F33"/>
+          <w:sz w:val="20"/>
+        </w:rPr>
+        <w:t>Not Sure Which CRM Setup Fits Your Business?</w:t>
+      </w:r>
+    </w:p>
+    <w:p>
+      <w:pPr>
+        <w:pStyle w:val="ListParagraph"/>
+        <w:numPr>
+          <w:ilvl w:val="0"/>
+          <w:numId w:val="2"/>
+        </w:numPr>
+        <w:spacing w:after="120"/>
+        <w:jc w:val="both"/>
+      </w:pPr>
+      <w:r>
+        <w:rPr>
+          <w:b/>
+          <w:color w:val="0A1F33"/>
+          <w:sz w:val="20"/>
+        </w:rPr>
+        <w:t xml:space="preserve">Body: </w:t>
+      </w:r>
+      <w:r>
+        <w:rPr>
+          <w:color w:val="0A1F33"/>
+          <w:sz w:val="20"/>
+        </w:rPr>
+        <w:t>Tell us how your team sells and serves today. We will suggest the right route, ready-made or custom, and what it would take to get started.</w:t>
+      </w:r>
+    </w:p>
+    <w:p>
+      <w:pPr>
+        <w:pStyle w:val="ListParagraph"/>
+        <w:numPr>
+          <w:ilvl w:val="0"/>
+          <w:numId w:val="2"/>
+        </w:numPr>
+        <w:spacing w:after="120"/>
+        <w:jc w:val="both"/>
+      </w:pPr>
+      <w:r>
+        <w:rPr>
+          <w:b/>
+          <w:color w:val="0A1F33"/>
+          <w:sz w:val="20"/>
+        </w:rPr>
+        <w:t xml:space="preserve">Button: </w:t>
+      </w:r>
+      <w:r>
+        <w:rPr>
+          <w:color w:val="0A1F33"/>
+          <w:sz w:val="20"/>
+        </w:rPr>
+        <w:t>Book a free consultation (links to #contact)</w:t>
+      </w:r>
+    </w:p>
+    <w:p>
+      <w:pPr>
+        <w:spacing w:after="120"/>
+      </w:pPr>
+    </w:p>
+    <w:p>
+      <w:pPr>
+        <w:pStyle w:val="Heading1"/>
+        <w:keepNext/>
+      </w:pPr>
+      <w:r>
+        <w:t>6. Types of CRM and Ready-Made vs Custom</w:t>
       </w:r>
     </w:p>
     <w:p>
@@ -2684,7 +2776,7 @@
         <w:keepNext/>
       </w:pPr>
       <w:r>
-        <w:t>6. CRM Reimplementation</w:t>
+        <w:t>7. CRM Reimplementation</w:t>
       </w:r>
     </w:p>
     <w:p>
@@ -3293,7 +3385,99 @@
         <w:keepNext/>
       </w:pPr>
       <w:r>
-        <w:t>7. Deployment Options</w:t>
+        <w:t>8. Mid-page CTA 2</w:t>
+      </w:r>
+    </w:p>
+    <w:p>
+      <w:pPr>
+        <w:pStyle w:val="ListParagraph"/>
+        <w:numPr>
+          <w:ilvl w:val="0"/>
+          <w:numId w:val="2"/>
+        </w:numPr>
+        <w:spacing w:after="120"/>
+        <w:jc w:val="both"/>
+      </w:pPr>
+      <w:r>
+        <w:rPr>
+          <w:b/>
+          <w:color w:val="0A1F33"/>
+          <w:sz w:val="20"/>
+        </w:rPr>
+        <w:t xml:space="preserve">H2: </w:t>
+      </w:r>
+      <w:r>
+        <w:rPr>
+          <w:color w:val="0A1F33"/>
+          <w:sz w:val="20"/>
+        </w:rPr>
+        <w:t>Is Your Current CRM Holding Your Team Back?</w:t>
+      </w:r>
+    </w:p>
+    <w:p>
+      <w:pPr>
+        <w:pStyle w:val="ListParagraph"/>
+        <w:numPr>
+          <w:ilvl w:val="0"/>
+          <w:numId w:val="2"/>
+        </w:numPr>
+        <w:spacing w:after="120"/>
+        <w:jc w:val="both"/>
+      </w:pPr>
+      <w:r>
+        <w:rPr>
+          <w:b/>
+          <w:color w:val="0A1F33"/>
+          <w:sz w:val="20"/>
+        </w:rPr>
+        <w:t xml:space="preserve">Body: </w:t>
+      </w:r>
+      <w:r>
+        <w:rPr>
+          <w:color w:val="0A1F33"/>
+          <w:sz w:val="20"/>
+        </w:rPr>
+        <w:t>Share what is not working and we will run a CRM health check, showing what to keep, fix or replace.</w:t>
+      </w:r>
+    </w:p>
+    <w:p>
+      <w:pPr>
+        <w:pStyle w:val="ListParagraph"/>
+        <w:numPr>
+          <w:ilvl w:val="0"/>
+          <w:numId w:val="2"/>
+        </w:numPr>
+        <w:spacing w:after="120"/>
+        <w:jc w:val="both"/>
+      </w:pPr>
+      <w:r>
+        <w:rPr>
+          <w:b/>
+          <w:color w:val="0A1F33"/>
+          <w:sz w:val="20"/>
+        </w:rPr>
+        <w:t xml:space="preserve">Button: </w:t>
+      </w:r>
+      <w:r>
+        <w:rPr>
+          <w:color w:val="0A1F33"/>
+          <w:sz w:val="20"/>
+        </w:rPr>
+        <w:t>Request a CRM health check (links to #contact)</w:t>
+      </w:r>
+    </w:p>
+    <w:p>
+      <w:pPr>
+        <w:spacing w:after="120"/>
+      </w:pPr>
+    </w:p>
+    <w:p>
+      <w:pPr>
+        <w:pStyle w:val="Heading1"/>
+        <w:keepNext/>
+      </w:pPr>
+      <w:r>
+        <w:t>9. Deployment Options</w:t>
       </w:r>
     </w:p>
     <w:p>
@@ -3560,7 +3744,7 @@
         <w:keepNext/>
       </w:pPr>
       <w:r>
-        <w:t>8. How We Deliver</w:t>
+        <w:t>10. How We Deliver</w:t>
       </w:r>
     </w:p>
     <w:p>
@@ -4043,7 +4227,7 @@
         <w:keepNext/>
       </w:pPr>
       <w:r>
-        <w:t>9. Industry Focus</w:t>
+        <w:t>11. Industry Focus</w:t>
       </w:r>
     </w:p>
     <w:p>
@@ -4878,7 +5062,7 @@
         <w:keepNext/>
       </w:pPr>
       <w:r>
-        <w:t>10. Why Choose HAMT Infotech</w:t>
+        <w:t>12. Mid-page CTA 3</w:t>
       </w:r>
     </w:p>
     <w:p>
@@ -4904,150 +5088,33 @@
           <w:color w:val="0A1F33"/>
           <w:sz w:val="20"/>
         </w:rPr>
-        <w:t>Why Choose HAMT Infotech for CRM Solutions in the UAE?</w:t>
-      </w:r>
-    </w:p>
-    <w:p>
-      <w:pPr>
-        <w:spacing w:after="80"/>
-        <w:jc w:val="both"/>
-      </w:pPr>
-      <w:r>
-        <w:rPr>
-          <w:color w:val="0A1F33"/>
-          <w:sz w:val="20"/>
-        </w:rPr>
-        <w:t>Five points (heading / copy):</w:t>
-      </w:r>
-    </w:p>
-    <w:p>
-      <w:pPr>
-        <w:pStyle w:val="ListParagraph"/>
-        <w:numPr>
-          <w:ilvl w:val="0"/>
-          <w:numId w:val="2"/>
-        </w:numPr>
-        <w:spacing w:after="120"/>
-        <w:jc w:val="both"/>
-      </w:pPr>
-      <w:r>
-        <w:rPr>
-          <w:b/>
-          <w:color w:val="0A1F33"/>
-          <w:sz w:val="20"/>
-        </w:rPr>
-        <w:t xml:space="preserve">26 Years in the UAE and GCC  -  </w:t>
-      </w:r>
-      <w:r>
-        <w:rPr>
-          <w:color w:val="0A1F33"/>
-          <w:sz w:val="20"/>
-        </w:rPr>
-        <w:t>We have worked with businesses across the region for 26 years, as advisors who understand how they operate and as engineers who build the systems they run on.</w:t>
-      </w:r>
-    </w:p>
-    <w:p>
-      <w:pPr>
-        <w:pStyle w:val="ListParagraph"/>
-        <w:numPr>
-          <w:ilvl w:val="0"/>
-          <w:numId w:val="2"/>
-        </w:numPr>
-        <w:spacing w:after="120"/>
-        <w:jc w:val="both"/>
-      </w:pPr>
-      <w:r>
-        <w:rPr>
-          <w:b/>
-          <w:color w:val="0A1F33"/>
-          <w:sz w:val="20"/>
-        </w:rPr>
-        <w:t xml:space="preserve">One Team for the Whole CRM  -  </w:t>
-      </w:r>
-      <w:r>
-        <w:rPr>
-          <w:color w:val="0A1F33"/>
-          <w:sz w:val="20"/>
-        </w:rPr>
-        <w:t>Discovery, design, configuration, development, data migration, ERP integration, training and support all come from one team, so you have one point of accountability.</w:t>
-      </w:r>
-    </w:p>
-    <w:p>
-      <w:pPr>
-        <w:pStyle w:val="ListParagraph"/>
-        <w:numPr>
-          <w:ilvl w:val="0"/>
-          <w:numId w:val="2"/>
-        </w:numPr>
-        <w:spacing w:after="120"/>
-        <w:jc w:val="both"/>
-      </w:pPr>
-      <w:r>
-        <w:rPr>
-          <w:b/>
-          <w:color w:val="0A1F33"/>
-          <w:sz w:val="20"/>
-        </w:rPr>
-        <w:t xml:space="preserve">SugarAI Expertise  -  </w:t>
-      </w:r>
-      <w:r>
-        <w:rPr>
-          <w:color w:val="0A1F33"/>
-          <w:sz w:val="20"/>
-        </w:rPr>
-        <w:t>We work with SugarAI every day, including its AI features, and we know where to stay close to standard and where a custom build is worth it.</w:t>
-      </w:r>
-    </w:p>
-    <w:p>
-      <w:pPr>
-        <w:pStyle w:val="ListParagraph"/>
-        <w:numPr>
-          <w:ilvl w:val="0"/>
-          <w:numId w:val="2"/>
-        </w:numPr>
-        <w:spacing w:after="120"/>
-        <w:jc w:val="both"/>
-      </w:pPr>
-      <w:r>
-        <w:rPr>
-          <w:b/>
-          <w:color w:val="0A1F33"/>
-          <w:sz w:val="20"/>
-        </w:rPr>
-        <w:t xml:space="preserve">Support After Go-Live  -  </w:t>
-      </w:r>
-      <w:r>
-        <w:rPr>
-          <w:color w:val="0A1F33"/>
-          <w:sz w:val="20"/>
-        </w:rPr>
-        <w:t>A dedicated support team takes over at launch and works to the service levels in your contract, with a single service desk and regular reviews.</w:t>
-      </w:r>
-    </w:p>
-    <w:p>
-      <w:pPr>
-        <w:pStyle w:val="ListParagraph"/>
-        <w:numPr>
-          <w:ilvl w:val="0"/>
-          <w:numId w:val="2"/>
-        </w:numPr>
-        <w:spacing w:after="120"/>
-        <w:jc w:val="both"/>
-      </w:pPr>
-      <w:r>
-        <w:rPr>
-          <w:b/>
-          <w:color w:val="0A1F33"/>
-          <w:sz w:val="20"/>
-        </w:rPr>
-        <w:t xml:space="preserve">Clear Scope and Timelines  -  </w:t>
-      </w:r>
-      <w:r>
-        <w:rPr>
-          <w:color w:val="0A1F33"/>
-          <w:sz w:val="20"/>
-        </w:rPr>
-        <w:t>Scope and timelines are agreed before work starts, and a named engagement lead stays with you from kickoff to go-live.</w:t>
+        <w:t>See How a CRM Would Work in Your Industry</w:t>
+      </w:r>
+    </w:p>
+    <w:p>
+      <w:pPr>
+        <w:pStyle w:val="ListParagraph"/>
+        <w:numPr>
+          <w:ilvl w:val="0"/>
+          <w:numId w:val="2"/>
+        </w:numPr>
+        <w:spacing w:after="120"/>
+        <w:jc w:val="both"/>
+      </w:pPr>
+      <w:r>
+        <w:rPr>
+          <w:b/>
+          <w:color w:val="0A1F33"/>
+          <w:sz w:val="20"/>
+        </w:rPr>
+        <w:t xml:space="preserve">Body: </w:t>
+      </w:r>
+      <w:r>
+        <w:rPr>
+          <w:color w:val="0A1F33"/>
+          <w:sz w:val="20"/>
+        </w:rPr>
+        <w:t>Tell us your sector and our team will walk you through the fields, stages and reports we would set up for you.</w:t>
       </w:r>
     </w:p>
     <w:p>
@@ -5073,7 +5140,7 @@
           <w:color w:val="0A1F33"/>
           <w:sz w:val="20"/>
         </w:rPr>
-        <w:t>Contact Us (existing, links to /contact-us/)</w:t>
+        <w:t>Talk to our CRM experts (links to #contact)</w:t>
       </w:r>
     </w:p>
     <w:p>
@@ -5087,7 +5154,7 @@
         <w:keepNext/>
       </w:pPr>
       <w:r>
-        <w:t>11. FAQ</w:t>
+        <w:t>13. Why Choose HAMT Infotech</w:t>
       </w:r>
     </w:p>
     <w:p>
@@ -5113,7 +5180,7 @@
           <w:color w:val="0A1F33"/>
           <w:sz w:val="20"/>
         </w:rPr>
-        <w:t>CRM Solutions UAE: Frequently Asked Questions</w:t>
+        <w:t>Why Choose HAMT Infotech for CRM Solutions in the UAE?</w:t>
       </w:r>
     </w:p>
     <w:p>
@@ -5126,413 +5193,163 @@
           <w:color w:val="0A1F33"/>
           <w:sz w:val="20"/>
         </w:rPr>
-        <w:t>Single accordion, first item open. 11 questions:</w:t>
-      </w:r>
-    </w:p>
-    <w:p>
-      <w:pPr>
-        <w:spacing w:after="40"/>
-        <w:jc w:val="both"/>
-      </w:pPr>
-      <w:r>
-        <w:rPr>
-          <w:b/>
-          <w:color w:val="0A1F33"/>
-          <w:sz w:val="20"/>
-        </w:rPr>
-        <w:t xml:space="preserve">Q: </w:t>
-      </w:r>
-      <w:r>
-        <w:rPr>
-          <w:b/>
-          <w:color w:val="0A1F33"/>
-          <w:sz w:val="20"/>
-        </w:rPr>
-        <w:t>What is a CRM, and why does a UAE business need one?</w:t>
-      </w:r>
-    </w:p>
-    <w:p>
-      <w:pPr>
-        <w:spacing w:after="100"/>
-        <w:jc w:val="both"/>
-      </w:pPr>
-      <w:r>
-        <w:rPr>
-          <w:color w:val="0A1F33"/>
-          <w:sz w:val="20"/>
-        </w:rPr>
-        <w:t>A CRM is software that keeps every customer interaction in one place, from the first enquiry to renewal and support. It helps your team follow up on time, see the full history of each customer and report on sales without spreadsheets. For UAE companies with many leads, channels and languages, it keeps everyone working from the same information.</w:t>
-      </w:r>
-    </w:p>
-    <w:p>
-      <w:pPr>
-        <w:spacing w:after="40"/>
-        <w:jc w:val="both"/>
-      </w:pPr>
-      <w:r>
-        <w:rPr>
-          <w:b/>
-          <w:color w:val="0A1F33"/>
-          <w:sz w:val="20"/>
-        </w:rPr>
-        <w:t xml:space="preserve">Q: </w:t>
-      </w:r>
-      <w:r>
-        <w:rPr>
-          <w:b/>
-          <w:color w:val="0A1F33"/>
-          <w:sz w:val="20"/>
-        </w:rPr>
-        <w:t>What is the difference between CRM software, CRM services and a CRM solution?</w:t>
-      </w:r>
-    </w:p>
-    <w:p>
-      <w:pPr>
-        <w:spacing w:after="100"/>
-        <w:jc w:val="both"/>
-      </w:pPr>
-      <w:r>
-        <w:rPr>
-          <w:color w:val="0A1F33"/>
-          <w:sz w:val="20"/>
-        </w:rPr>
-        <w:t>CRM software is the platform itself. CRM services are the work around it, such as consulting, implementation, customization, integration and support. A CRM solution is the finished result: the right software, set up, connected and supported to fit your business. HAMT Infotech provides all three.</w:t>
-      </w:r>
-    </w:p>
-    <w:p>
-      <w:pPr>
-        <w:spacing w:after="40"/>
-        <w:jc w:val="both"/>
-      </w:pPr>
-      <w:r>
-        <w:rPr>
-          <w:b/>
-          <w:color w:val="0A1F33"/>
-          <w:sz w:val="20"/>
-        </w:rPr>
-        <w:t xml:space="preserve">Q: </w:t>
-      </w:r>
-      <w:r>
-        <w:rPr>
-          <w:b/>
-          <w:color w:val="0A1F33"/>
-          <w:sz w:val="20"/>
-        </w:rPr>
-        <w:t>When should we reimplement our current CRM?</w:t>
-      </w:r>
-    </w:p>
-    <w:p>
-      <w:pPr>
-        <w:spacing w:after="100"/>
-        <w:jc w:val="both"/>
-      </w:pPr>
-      <w:r>
-        <w:rPr>
-          <w:color w:val="0A1F33"/>
-          <w:sz w:val="20"/>
-        </w:rPr>
-        <w:t>Consider it when your team avoids the CRM, data is inconsistent, reports cannot be trusted, or the system no longer fits how you work or grow. We start with a health check to find what is really wrong. Often the platform is fine and the setup needs resetting, so you keep your investment and fix the foundations.</w:t>
-      </w:r>
-    </w:p>
-    <w:p>
-      <w:pPr>
-        <w:spacing w:after="40"/>
-        <w:jc w:val="both"/>
-      </w:pPr>
-      <w:r>
-        <w:rPr>
-          <w:b/>
-          <w:color w:val="0A1F33"/>
-          <w:sz w:val="20"/>
-        </w:rPr>
-        <w:t xml:space="preserve">Q: </w:t>
-      </w:r>
-      <w:r>
-        <w:rPr>
-          <w:b/>
-          <w:color w:val="0A1F33"/>
-          <w:sz w:val="20"/>
-        </w:rPr>
-        <w:t>What is SugarAI, and how is it different from Sugar CRM?</w:t>
-      </w:r>
-    </w:p>
-    <w:p>
-      <w:pPr>
-        <w:spacing w:after="100"/>
-        <w:jc w:val="both"/>
-      </w:pPr>
-      <w:r>
-        <w:rPr>
-          <w:color w:val="0A1F33"/>
-          <w:sz w:val="20"/>
-        </w:rPr>
-        <w:t>SugarAI is the intelligent evolution of Sugar CRM. It keeps the sales, service and marketing platform and adds built-in predictive AI that scores leads, flags at-risk deals and drafts account summaries automatically.</w:t>
-      </w:r>
-    </w:p>
-    <w:p>
-      <w:pPr>
-        <w:spacing w:after="40"/>
-        <w:jc w:val="both"/>
-      </w:pPr>
-      <w:r>
-        <w:rPr>
-          <w:b/>
-          <w:color w:val="0A1F33"/>
-          <w:sz w:val="20"/>
-        </w:rPr>
-        <w:t xml:space="preserve">Q: </w:t>
-      </w:r>
-      <w:r>
-        <w:rPr>
-          <w:b/>
-          <w:color w:val="0A1F33"/>
-          <w:sz w:val="20"/>
-        </w:rPr>
-        <w:t>How quickly can we go live?</w:t>
-      </w:r>
-    </w:p>
-    <w:p>
-      <w:pPr>
-        <w:spacing w:after="100"/>
-        <w:jc w:val="both"/>
-      </w:pPr>
-      <w:r>
-        <w:rPr>
-          <w:color w:val="0A1F33"/>
-          <w:sz w:val="20"/>
-        </w:rPr>
-        <w:t>With Guided Low-Touch onboarding, we provision a working system on day one and teams can go live within days. Larger programmes with ERP integration and several entities follow a phased plan, with timelines agreed before work starts.</w:t>
-      </w:r>
-    </w:p>
-    <w:p>
-      <w:pPr>
-        <w:spacing w:after="40"/>
-        <w:jc w:val="both"/>
-      </w:pPr>
-      <w:r>
-        <w:rPr>
-          <w:b/>
-          <w:color w:val="0A1F33"/>
-          <w:sz w:val="20"/>
-        </w:rPr>
-        <w:t xml:space="preserve">Q: </w:t>
-      </w:r>
-      <w:r>
-        <w:rPr>
-          <w:b/>
-          <w:color w:val="0A1F33"/>
-          <w:sz w:val="20"/>
-        </w:rPr>
-        <w:t>Can SugarAI work if our customer data is incomplete?</w:t>
-      </w:r>
-    </w:p>
-    <w:p>
-      <w:pPr>
-        <w:spacing w:after="100"/>
-        <w:jc w:val="both"/>
-      </w:pPr>
-      <w:r>
-        <w:rPr>
-          <w:color w:val="0A1F33"/>
-          <w:sz w:val="20"/>
-        </w:rPr>
-        <w:t>Yes. SugarAI is built to give useful predictions from partial or ageing records, so you do not need a perfect database before you start. Data improves as your team uses the system.</w:t>
-      </w:r>
-    </w:p>
-    <w:p>
-      <w:pPr>
-        <w:spacing w:after="40"/>
-        <w:jc w:val="both"/>
-      </w:pPr>
-      <w:r>
-        <w:rPr>
-          <w:b/>
-          <w:color w:val="0A1F33"/>
-          <w:sz w:val="20"/>
-        </w:rPr>
-        <w:t xml:space="preserve">Q: </w:t>
-      </w:r>
-      <w:r>
-        <w:rPr>
-          <w:b/>
-          <w:color w:val="0A1F33"/>
-          <w:sz w:val="20"/>
-        </w:rPr>
-        <w:t>Can you connect the CRM to our ERP and other systems?</w:t>
-      </w:r>
-    </w:p>
-    <w:p>
-      <w:pPr>
-        <w:spacing w:after="100"/>
-        <w:jc w:val="both"/>
-      </w:pPr>
-      <w:r>
-        <w:rPr>
-          <w:color w:val="0A1F33"/>
-          <w:sz w:val="20"/>
-        </w:rPr>
-        <w:t>Yes. CRM integration is a core part of our work. We connect SugarAI with ERP and finance platforms, your website, email and marketing tools, so quotes, orders and customer details move between systems automatically.</w:t>
-      </w:r>
-    </w:p>
-    <w:p>
-      <w:pPr>
-        <w:spacing w:after="40"/>
-        <w:jc w:val="both"/>
-      </w:pPr>
-      <w:r>
-        <w:rPr>
-          <w:b/>
-          <w:color w:val="0A1F33"/>
-          <w:sz w:val="20"/>
-        </w:rPr>
-        <w:t xml:space="preserve">Q: </w:t>
-      </w:r>
-      <w:r>
-        <w:rPr>
-          <w:b/>
-          <w:color w:val="0A1F33"/>
-          <w:sz w:val="20"/>
-        </w:rPr>
-        <w:t>Can you move our data from spreadsheets or our current CRM?</w:t>
-      </w:r>
-    </w:p>
-    <w:p>
-      <w:pPr>
-        <w:spacing w:after="100"/>
-        <w:jc w:val="both"/>
-      </w:pPr>
-      <w:r>
-        <w:rPr>
-          <w:color w:val="0A1F33"/>
-          <w:sz w:val="20"/>
-        </w:rPr>
-        <w:t>Yes. We clean your data, map it to the new structure and carry across the history that matters. Migration is planned so your teams keep working with minimal disruption.</w:t>
-      </w:r>
-    </w:p>
-    <w:p>
-      <w:pPr>
-        <w:spacing w:after="40"/>
-        <w:jc w:val="both"/>
-      </w:pPr>
-      <w:r>
-        <w:rPr>
-          <w:b/>
-          <w:color w:val="0A1F33"/>
-          <w:sz w:val="20"/>
-        </w:rPr>
-        <w:t xml:space="preserve">Q: </w:t>
-      </w:r>
-      <w:r>
-        <w:rPr>
-          <w:b/>
-          <w:color w:val="0A1F33"/>
-          <w:sz w:val="20"/>
-        </w:rPr>
-        <w:t>Can the CRM be customised for our industry?</w:t>
-      </w:r>
-    </w:p>
-    <w:p>
-      <w:pPr>
-        <w:spacing w:after="100"/>
-        <w:jc w:val="both"/>
-      </w:pPr>
-      <w:r>
-        <w:rPr>
-          <w:color w:val="0A1F33"/>
-          <w:sz w:val="20"/>
-        </w:rPr>
-        <w:t>Yes. We start from an industry blueprint with the fields, stages, reports and integrations your sector needs, then fit it to your business. Where your process is unusual, we build custom fields, modules and plugins inside SugarAI.</w:t>
-      </w:r>
-    </w:p>
-    <w:p>
-      <w:pPr>
-        <w:spacing w:after="40"/>
-        <w:jc w:val="both"/>
-      </w:pPr>
-      <w:r>
-        <w:rPr>
-          <w:b/>
-          <w:color w:val="0A1F33"/>
-          <w:sz w:val="20"/>
-        </w:rPr>
-        <w:t xml:space="preserve">Q: </w:t>
-      </w:r>
-      <w:r>
-        <w:rPr>
-          <w:b/>
-          <w:color w:val="0A1F33"/>
-          <w:sz w:val="20"/>
-        </w:rPr>
-        <w:t>Is cloud or on-premises better for us?</w:t>
-      </w:r>
-    </w:p>
-    <w:p>
-      <w:pPr>
-        <w:spacing w:after="100"/>
-        <w:jc w:val="both"/>
-      </w:pPr>
-      <w:r>
-        <w:rPr>
-          <w:color w:val="0A1F33"/>
-          <w:sz w:val="20"/>
-        </w:rPr>
-        <w:t>Cloud is usually quicker to launch and needs no hardware. On-premises, or a private cloud, suits organisations that must keep data in their own environment, such as banks. We compare both against your regulatory and growth needs before you decide.</w:t>
-      </w:r>
-    </w:p>
-    <w:p>
-      <w:pPr>
-        <w:spacing w:after="40"/>
-        <w:jc w:val="both"/>
-      </w:pPr>
-      <w:r>
-        <w:rPr>
-          <w:b/>
-          <w:color w:val="0A1F33"/>
-          <w:sz w:val="20"/>
-        </w:rPr>
-        <w:t xml:space="preserve">Q: </w:t>
-      </w:r>
-      <w:r>
-        <w:rPr>
-          <w:b/>
-          <w:color w:val="0A1F33"/>
-          <w:sz w:val="20"/>
-        </w:rPr>
-        <w:t>Do you support us after go-live?</w:t>
-      </w:r>
-    </w:p>
-    <w:p>
-      <w:pPr>
-        <w:spacing w:after="100"/>
-        <w:jc w:val="both"/>
-      </w:pPr>
-      <w:r>
-        <w:rPr>
-          <w:color w:val="0A1F33"/>
-          <w:sz w:val="20"/>
-        </w:rPr>
-        <w:t>Yes. A dedicated support team takes over at go-live and works to the service levels in your contract. Requests go through a single service desk and are reviewed with you regularly.</w:t>
-      </w:r>
-    </w:p>
-    <w:p>
-      <w:pPr>
-        <w:pStyle w:val="Heading2"/>
-      </w:pPr>
-      <w:r>
-        <w:t>Sources</w:t>
-      </w:r>
-    </w:p>
-    <w:p>
-      <w:pPr>
-        <w:spacing w:after="80"/>
-        <w:jc w:val="both"/>
-      </w:pPr>
-      <w:r>
-        <w:rPr>
-          <w:color w:val="0A1F33"/>
-          <w:sz w:val="20"/>
-        </w:rPr>
-        <w:t>No statistics or third-party figures are used on this page, so no external sources are cited. Platform and delivery details come from HLB HAMT's own SugarAI CRM page.</w:t>
+        <w:t>Five points (heading / copy):</w:t>
+      </w:r>
+    </w:p>
+    <w:p>
+      <w:pPr>
+        <w:pStyle w:val="ListParagraph"/>
+        <w:numPr>
+          <w:ilvl w:val="0"/>
+          <w:numId w:val="2"/>
+        </w:numPr>
+        <w:spacing w:after="120"/>
+        <w:jc w:val="both"/>
+      </w:pPr>
+      <w:r>
+        <w:rPr>
+          <w:b/>
+          <w:color w:val="0A1F33"/>
+          <w:sz w:val="20"/>
+        </w:rPr>
+        <w:t xml:space="preserve">26 Years in the UAE and GCC  -  </w:t>
+      </w:r>
+      <w:r>
+        <w:rPr>
+          <w:color w:val="0A1F33"/>
+          <w:sz w:val="20"/>
+        </w:rPr>
+        <w:t>We have worked with businesses across the region for 26 years, as advisors who understand how they operate and as engineers who build the systems they run on.</w:t>
+      </w:r>
+    </w:p>
+    <w:p>
+      <w:pPr>
+        <w:pStyle w:val="ListParagraph"/>
+        <w:numPr>
+          <w:ilvl w:val="0"/>
+          <w:numId w:val="2"/>
+        </w:numPr>
+        <w:spacing w:after="120"/>
+        <w:jc w:val="both"/>
+      </w:pPr>
+      <w:r>
+        <w:rPr>
+          <w:b/>
+          <w:color w:val="0A1F33"/>
+          <w:sz w:val="20"/>
+        </w:rPr>
+        <w:t xml:space="preserve">One Team for the Whole CRM  -  </w:t>
+      </w:r>
+      <w:r>
+        <w:rPr>
+          <w:color w:val="0A1F33"/>
+          <w:sz w:val="20"/>
+        </w:rPr>
+        <w:t>Discovery, design, configuration, development, data migration, ERP integration, training and support all come from one team, so you have one point of accountability.</w:t>
+      </w:r>
+    </w:p>
+    <w:p>
+      <w:pPr>
+        <w:pStyle w:val="ListParagraph"/>
+        <w:numPr>
+          <w:ilvl w:val="0"/>
+          <w:numId w:val="2"/>
+        </w:numPr>
+        <w:spacing w:after="120"/>
+        <w:jc w:val="both"/>
+      </w:pPr>
+      <w:r>
+        <w:rPr>
+          <w:b/>
+          <w:color w:val="0A1F33"/>
+          <w:sz w:val="20"/>
+        </w:rPr>
+        <w:t xml:space="preserve">SugarAI Expertise  -  </w:t>
+      </w:r>
+      <w:r>
+        <w:rPr>
+          <w:color w:val="0A1F33"/>
+          <w:sz w:val="20"/>
+        </w:rPr>
+        <w:t>We work with SugarAI every day, including its AI features, and we know where to stay close to standard and where a custom build is worth it.</w:t>
+      </w:r>
+    </w:p>
+    <w:p>
+      <w:pPr>
+        <w:pStyle w:val="ListParagraph"/>
+        <w:numPr>
+          <w:ilvl w:val="0"/>
+          <w:numId w:val="2"/>
+        </w:numPr>
+        <w:spacing w:after="120"/>
+        <w:jc w:val="both"/>
+      </w:pPr>
+      <w:r>
+        <w:rPr>
+          <w:b/>
+          <w:color w:val="0A1F33"/>
+          <w:sz w:val="20"/>
+        </w:rPr>
+        <w:t xml:space="preserve">Support After Go-Live  -  </w:t>
+      </w:r>
+      <w:r>
+        <w:rPr>
+          <w:color w:val="0A1F33"/>
+          <w:sz w:val="20"/>
+        </w:rPr>
+        <w:t>A dedicated support team takes over at launch and works to the service levels in your contract, with a single service desk and regular reviews.</w:t>
+      </w:r>
+    </w:p>
+    <w:p>
+      <w:pPr>
+        <w:pStyle w:val="ListParagraph"/>
+        <w:numPr>
+          <w:ilvl w:val="0"/>
+          <w:numId w:val="2"/>
+        </w:numPr>
+        <w:spacing w:after="120"/>
+        <w:jc w:val="both"/>
+      </w:pPr>
+      <w:r>
+        <w:rPr>
+          <w:b/>
+          <w:color w:val="0A1F33"/>
+          <w:sz w:val="20"/>
+        </w:rPr>
+        <w:t xml:space="preserve">Clear Scope and Timelines  -  </w:t>
+      </w:r>
+      <w:r>
+        <w:rPr>
+          <w:color w:val="0A1F33"/>
+          <w:sz w:val="20"/>
+        </w:rPr>
+        <w:t>Scope and timelines are agreed before work starts, and a named engagement lead stays with you from kickoff to go-live.</w:t>
+      </w:r>
+    </w:p>
+    <w:p>
+      <w:pPr>
+        <w:pStyle w:val="ListParagraph"/>
+        <w:numPr>
+          <w:ilvl w:val="0"/>
+          <w:numId w:val="2"/>
+        </w:numPr>
+        <w:spacing w:after="120"/>
+        <w:jc w:val="both"/>
+      </w:pPr>
+      <w:r>
+        <w:rPr>
+          <w:b/>
+          <w:color w:val="0A1F33"/>
+          <w:sz w:val="20"/>
+        </w:rPr>
+        <w:t xml:space="preserve">Button: </w:t>
+      </w:r>
+      <w:r>
+        <w:rPr>
+          <w:color w:val="0A1F33"/>
+          <w:sz w:val="20"/>
+        </w:rPr>
+        <w:t>Contact Us (existing, links to /contact-us/)</w:t>
       </w:r>
     </w:p>
     <w:p>
@@ -5546,7 +5363,558 @@
         <w:keepNext/>
       </w:pPr>
       <w:r>
-        <w:t>12. Existing Blocks Kept As They Are</w:t>
+        <w:t>14. FAQ</w:t>
+      </w:r>
+    </w:p>
+    <w:p>
+      <w:pPr>
+        <w:pStyle w:val="ListParagraph"/>
+        <w:numPr>
+          <w:ilvl w:val="0"/>
+          <w:numId w:val="2"/>
+        </w:numPr>
+        <w:spacing w:after="120"/>
+        <w:jc w:val="both"/>
+      </w:pPr>
+      <w:r>
+        <w:rPr>
+          <w:b/>
+          <w:color w:val="0A1F33"/>
+          <w:sz w:val="20"/>
+        </w:rPr>
+        <w:t xml:space="preserve">H2: </w:t>
+      </w:r>
+      <w:r>
+        <w:rPr>
+          <w:color w:val="0A1F33"/>
+          <w:sz w:val="20"/>
+        </w:rPr>
+        <w:t>CRM Solutions UAE: Frequently Asked Questions</w:t>
+      </w:r>
+    </w:p>
+    <w:p>
+      <w:pPr>
+        <w:spacing w:after="80"/>
+        <w:jc w:val="both"/>
+      </w:pPr>
+      <w:r>
+        <w:rPr>
+          <w:color w:val="0A1F33"/>
+          <w:sz w:val="20"/>
+        </w:rPr>
+        <w:t>Single accordion, first item open. 11 questions:</w:t>
+      </w:r>
+    </w:p>
+    <w:p>
+      <w:pPr>
+        <w:spacing w:after="40"/>
+        <w:jc w:val="both"/>
+      </w:pPr>
+      <w:r>
+        <w:rPr>
+          <w:b/>
+          <w:color w:val="0A1F33"/>
+          <w:sz w:val="20"/>
+        </w:rPr>
+        <w:t xml:space="preserve">Q: </w:t>
+      </w:r>
+      <w:r>
+        <w:rPr>
+          <w:b/>
+          <w:color w:val="0A1F33"/>
+          <w:sz w:val="20"/>
+        </w:rPr>
+        <w:t>What is a CRM, and why does a UAE business need one?</w:t>
+      </w:r>
+    </w:p>
+    <w:p>
+      <w:pPr>
+        <w:spacing w:after="100"/>
+        <w:jc w:val="both"/>
+      </w:pPr>
+      <w:r>
+        <w:rPr>
+          <w:color w:val="0A1F33"/>
+          <w:sz w:val="20"/>
+        </w:rPr>
+        <w:t>A CRM is software that keeps every customer interaction in one place, from the first enquiry to renewal and support. It helps your team follow up on time, see the full history of each customer and report on sales without spreadsheets. For UAE companies with many leads, channels and languages, it keeps everyone working from the same information.</w:t>
+      </w:r>
+    </w:p>
+    <w:p>
+      <w:pPr>
+        <w:spacing w:after="40"/>
+        <w:jc w:val="both"/>
+      </w:pPr>
+      <w:r>
+        <w:rPr>
+          <w:b/>
+          <w:color w:val="0A1F33"/>
+          <w:sz w:val="20"/>
+        </w:rPr>
+        <w:t xml:space="preserve">Q: </w:t>
+      </w:r>
+      <w:r>
+        <w:rPr>
+          <w:b/>
+          <w:color w:val="0A1F33"/>
+          <w:sz w:val="20"/>
+        </w:rPr>
+        <w:t>What is the difference between CRM software, CRM services and a CRM solution?</w:t>
+      </w:r>
+    </w:p>
+    <w:p>
+      <w:pPr>
+        <w:spacing w:after="100"/>
+        <w:jc w:val="both"/>
+      </w:pPr>
+      <w:r>
+        <w:rPr>
+          <w:color w:val="0A1F33"/>
+          <w:sz w:val="20"/>
+        </w:rPr>
+        <w:t>CRM software is the platform itself. CRM services are the work around it, such as consulting, implementation, customization, integration and support. A CRM solution is the finished result: the right software, set up, connected and supported to fit your business. HAMT Infotech provides all three.</w:t>
+      </w:r>
+    </w:p>
+    <w:p>
+      <w:pPr>
+        <w:spacing w:after="40"/>
+        <w:jc w:val="both"/>
+      </w:pPr>
+      <w:r>
+        <w:rPr>
+          <w:b/>
+          <w:color w:val="0A1F33"/>
+          <w:sz w:val="20"/>
+        </w:rPr>
+        <w:t xml:space="preserve">Q: </w:t>
+      </w:r>
+      <w:r>
+        <w:rPr>
+          <w:b/>
+          <w:color w:val="0A1F33"/>
+          <w:sz w:val="20"/>
+        </w:rPr>
+        <w:t>When should we reimplement our current CRM?</w:t>
+      </w:r>
+    </w:p>
+    <w:p>
+      <w:pPr>
+        <w:spacing w:after="100"/>
+        <w:jc w:val="both"/>
+      </w:pPr>
+      <w:r>
+        <w:rPr>
+          <w:color w:val="0A1F33"/>
+          <w:sz w:val="20"/>
+        </w:rPr>
+        <w:t>Consider it when your team avoids the CRM, data is inconsistent, reports cannot be trusted, or the system no longer fits how you work or grow. We start with a health check to find what is really wrong. Often the platform is fine and the setup needs resetting, so you keep your investment and fix the foundations.</w:t>
+      </w:r>
+    </w:p>
+    <w:p>
+      <w:pPr>
+        <w:spacing w:after="40"/>
+        <w:jc w:val="both"/>
+      </w:pPr>
+      <w:r>
+        <w:rPr>
+          <w:b/>
+          <w:color w:val="0A1F33"/>
+          <w:sz w:val="20"/>
+        </w:rPr>
+        <w:t xml:space="preserve">Q: </w:t>
+      </w:r>
+      <w:r>
+        <w:rPr>
+          <w:b/>
+          <w:color w:val="0A1F33"/>
+          <w:sz w:val="20"/>
+        </w:rPr>
+        <w:t>What is SugarAI, and how is it different from Sugar CRM?</w:t>
+      </w:r>
+    </w:p>
+    <w:p>
+      <w:pPr>
+        <w:spacing w:after="100"/>
+        <w:jc w:val="both"/>
+      </w:pPr>
+      <w:r>
+        <w:rPr>
+          <w:color w:val="0A1F33"/>
+          <w:sz w:val="20"/>
+        </w:rPr>
+        <w:t>SugarAI is the intelligent evolution of Sugar CRM. It keeps the sales, service and marketing platform and adds built-in predictive AI that scores leads, flags at-risk deals and drafts account summaries automatically.</w:t>
+      </w:r>
+    </w:p>
+    <w:p>
+      <w:pPr>
+        <w:spacing w:after="40"/>
+        <w:jc w:val="both"/>
+      </w:pPr>
+      <w:r>
+        <w:rPr>
+          <w:b/>
+          <w:color w:val="0A1F33"/>
+          <w:sz w:val="20"/>
+        </w:rPr>
+        <w:t xml:space="preserve">Q: </w:t>
+      </w:r>
+      <w:r>
+        <w:rPr>
+          <w:b/>
+          <w:color w:val="0A1F33"/>
+          <w:sz w:val="20"/>
+        </w:rPr>
+        <w:t>How quickly can we go live?</w:t>
+      </w:r>
+    </w:p>
+    <w:p>
+      <w:pPr>
+        <w:spacing w:after="100"/>
+        <w:jc w:val="both"/>
+      </w:pPr>
+      <w:r>
+        <w:rPr>
+          <w:color w:val="0A1F33"/>
+          <w:sz w:val="20"/>
+        </w:rPr>
+        <w:t>With Guided Low-Touch onboarding, we provision a working system on day one and teams can go live within days. Larger programmes with ERP integration and several entities follow a phased plan, with timelines agreed before work starts.</w:t>
+      </w:r>
+    </w:p>
+    <w:p>
+      <w:pPr>
+        <w:spacing w:after="40"/>
+        <w:jc w:val="both"/>
+      </w:pPr>
+      <w:r>
+        <w:rPr>
+          <w:b/>
+          <w:color w:val="0A1F33"/>
+          <w:sz w:val="20"/>
+        </w:rPr>
+        <w:t xml:space="preserve">Q: </w:t>
+      </w:r>
+      <w:r>
+        <w:rPr>
+          <w:b/>
+          <w:color w:val="0A1F33"/>
+          <w:sz w:val="20"/>
+        </w:rPr>
+        <w:t>Can SugarAI work if our customer data is incomplete?</w:t>
+      </w:r>
+    </w:p>
+    <w:p>
+      <w:pPr>
+        <w:spacing w:after="100"/>
+        <w:jc w:val="both"/>
+      </w:pPr>
+      <w:r>
+        <w:rPr>
+          <w:color w:val="0A1F33"/>
+          <w:sz w:val="20"/>
+        </w:rPr>
+        <w:t>Yes. SugarAI is built to give useful predictions from partial or ageing records, so you do not need a perfect database before you start. Data improves as your team uses the system.</w:t>
+      </w:r>
+    </w:p>
+    <w:p>
+      <w:pPr>
+        <w:spacing w:after="40"/>
+        <w:jc w:val="both"/>
+      </w:pPr>
+      <w:r>
+        <w:rPr>
+          <w:b/>
+          <w:color w:val="0A1F33"/>
+          <w:sz w:val="20"/>
+        </w:rPr>
+        <w:t xml:space="preserve">Q: </w:t>
+      </w:r>
+      <w:r>
+        <w:rPr>
+          <w:b/>
+          <w:color w:val="0A1F33"/>
+          <w:sz w:val="20"/>
+        </w:rPr>
+        <w:t>Can you connect the CRM to our ERP and other systems?</w:t>
+      </w:r>
+    </w:p>
+    <w:p>
+      <w:pPr>
+        <w:spacing w:after="100"/>
+        <w:jc w:val="both"/>
+      </w:pPr>
+      <w:r>
+        <w:rPr>
+          <w:color w:val="0A1F33"/>
+          <w:sz w:val="20"/>
+        </w:rPr>
+        <w:t>Yes. CRM integration is a core part of our work. We connect SugarAI with ERP and finance platforms, your website, email and marketing tools, so quotes, orders and customer details move between systems automatically.</w:t>
+      </w:r>
+    </w:p>
+    <w:p>
+      <w:pPr>
+        <w:spacing w:after="40"/>
+        <w:jc w:val="both"/>
+      </w:pPr>
+      <w:r>
+        <w:rPr>
+          <w:b/>
+          <w:color w:val="0A1F33"/>
+          <w:sz w:val="20"/>
+        </w:rPr>
+        <w:t xml:space="preserve">Q: </w:t>
+      </w:r>
+      <w:r>
+        <w:rPr>
+          <w:b/>
+          <w:color w:val="0A1F33"/>
+          <w:sz w:val="20"/>
+        </w:rPr>
+        <w:t>Can you move our data from spreadsheets or our current CRM?</w:t>
+      </w:r>
+    </w:p>
+    <w:p>
+      <w:pPr>
+        <w:spacing w:after="100"/>
+        <w:jc w:val="both"/>
+      </w:pPr>
+      <w:r>
+        <w:rPr>
+          <w:color w:val="0A1F33"/>
+          <w:sz w:val="20"/>
+        </w:rPr>
+        <w:t>Yes. We clean your data, map it to the new structure and carry across the history that matters. Migration is planned so your teams keep working with minimal disruption.</w:t>
+      </w:r>
+    </w:p>
+    <w:p>
+      <w:pPr>
+        <w:spacing w:after="40"/>
+        <w:jc w:val="both"/>
+      </w:pPr>
+      <w:r>
+        <w:rPr>
+          <w:b/>
+          <w:color w:val="0A1F33"/>
+          <w:sz w:val="20"/>
+        </w:rPr>
+        <w:t xml:space="preserve">Q: </w:t>
+      </w:r>
+      <w:r>
+        <w:rPr>
+          <w:b/>
+          <w:color w:val="0A1F33"/>
+          <w:sz w:val="20"/>
+        </w:rPr>
+        <w:t>Can the CRM be customised for our industry?</w:t>
+      </w:r>
+    </w:p>
+    <w:p>
+      <w:pPr>
+        <w:spacing w:after="100"/>
+        <w:jc w:val="both"/>
+      </w:pPr>
+      <w:r>
+        <w:rPr>
+          <w:color w:val="0A1F33"/>
+          <w:sz w:val="20"/>
+        </w:rPr>
+        <w:t>Yes. We start from an industry blueprint with the fields, stages, reports and integrations your sector needs, then fit it to your business. Where your process is unusual, we build custom fields, modules and plugins inside SugarAI.</w:t>
+      </w:r>
+    </w:p>
+    <w:p>
+      <w:pPr>
+        <w:spacing w:after="40"/>
+        <w:jc w:val="both"/>
+      </w:pPr>
+      <w:r>
+        <w:rPr>
+          <w:b/>
+          <w:color w:val="0A1F33"/>
+          <w:sz w:val="20"/>
+        </w:rPr>
+        <w:t xml:space="preserve">Q: </w:t>
+      </w:r>
+      <w:r>
+        <w:rPr>
+          <w:b/>
+          <w:color w:val="0A1F33"/>
+          <w:sz w:val="20"/>
+        </w:rPr>
+        <w:t>Is cloud or on-premises better for us?</w:t>
+      </w:r>
+    </w:p>
+    <w:p>
+      <w:pPr>
+        <w:spacing w:after="100"/>
+        <w:jc w:val="both"/>
+      </w:pPr>
+      <w:r>
+        <w:rPr>
+          <w:color w:val="0A1F33"/>
+          <w:sz w:val="20"/>
+        </w:rPr>
+        <w:t>Cloud is usually quicker to launch and needs no hardware. On-premises, or a private cloud, suits organisations that must keep data in their own environment, such as banks. We compare both against your regulatory and growth needs before you decide.</w:t>
+      </w:r>
+    </w:p>
+    <w:p>
+      <w:pPr>
+        <w:spacing w:after="40"/>
+        <w:jc w:val="both"/>
+      </w:pPr>
+      <w:r>
+        <w:rPr>
+          <w:b/>
+          <w:color w:val="0A1F33"/>
+          <w:sz w:val="20"/>
+        </w:rPr>
+        <w:t xml:space="preserve">Q: </w:t>
+      </w:r>
+      <w:r>
+        <w:rPr>
+          <w:b/>
+          <w:color w:val="0A1F33"/>
+          <w:sz w:val="20"/>
+        </w:rPr>
+        <w:t>Do you support us after go-live?</w:t>
+      </w:r>
+    </w:p>
+    <w:p>
+      <w:pPr>
+        <w:spacing w:after="100"/>
+        <w:jc w:val="both"/>
+      </w:pPr>
+      <w:r>
+        <w:rPr>
+          <w:color w:val="0A1F33"/>
+          <w:sz w:val="20"/>
+        </w:rPr>
+        <w:t>Yes. A dedicated support team takes over at go-live and works to the service levels in your contract. Requests go through a single service desk and are reviewed with you regularly.</w:t>
+      </w:r>
+    </w:p>
+    <w:p>
+      <w:pPr>
+        <w:pStyle w:val="Heading2"/>
+      </w:pPr>
+      <w:r>
+        <w:t>Sources</w:t>
+      </w:r>
+    </w:p>
+    <w:p>
+      <w:pPr>
+        <w:spacing w:after="80"/>
+        <w:jc w:val="both"/>
+      </w:pPr>
+      <w:r>
+        <w:rPr>
+          <w:color w:val="0A1F33"/>
+          <w:sz w:val="20"/>
+        </w:rPr>
+        <w:t>No statistics or third-party figures are used on this page, so no external sources are cited. Platform and delivery details come from HLB HAMT's own SugarAI CRM page.</w:t>
+      </w:r>
+    </w:p>
+    <w:p>
+      <w:pPr>
+        <w:spacing w:after="120"/>
+      </w:pPr>
+    </w:p>
+    <w:p>
+      <w:pPr>
+        <w:pStyle w:val="Heading1"/>
+        <w:keepNext/>
+      </w:pPr>
+      <w:r>
+        <w:t>15. Mid-page CTA 4</w:t>
+      </w:r>
+    </w:p>
+    <w:p>
+      <w:pPr>
+        <w:pStyle w:val="ListParagraph"/>
+        <w:numPr>
+          <w:ilvl w:val="0"/>
+          <w:numId w:val="2"/>
+        </w:numPr>
+        <w:spacing w:after="120"/>
+        <w:jc w:val="both"/>
+      </w:pPr>
+      <w:r>
+        <w:rPr>
+          <w:b/>
+          <w:color w:val="0A1F33"/>
+          <w:sz w:val="20"/>
+        </w:rPr>
+        <w:t xml:space="preserve">H2: </w:t>
+      </w:r>
+      <w:r>
+        <w:rPr>
+          <w:color w:val="0A1F33"/>
+          <w:sz w:val="20"/>
+        </w:rPr>
+        <w:t>Ready to Put Your Customer Data to Work?</w:t>
+      </w:r>
+    </w:p>
+    <w:p>
+      <w:pPr>
+        <w:pStyle w:val="ListParagraph"/>
+        <w:numPr>
+          <w:ilvl w:val="0"/>
+          <w:numId w:val="2"/>
+        </w:numPr>
+        <w:spacing w:after="120"/>
+        <w:jc w:val="both"/>
+      </w:pPr>
+      <w:r>
+        <w:rPr>
+          <w:b/>
+          <w:color w:val="0A1F33"/>
+          <w:sz w:val="20"/>
+        </w:rPr>
+        <w:t xml:space="preserve">Body: </w:t>
+      </w:r>
+      <w:r>
+        <w:rPr>
+          <w:color w:val="0A1F33"/>
+          <w:sz w:val="20"/>
+        </w:rPr>
+        <w:t>Schedule a call with our CRM team and leave with a clear plan, scope and timeline for your project.</w:t>
+      </w:r>
+    </w:p>
+    <w:p>
+      <w:pPr>
+        <w:pStyle w:val="ListParagraph"/>
+        <w:numPr>
+          <w:ilvl w:val="0"/>
+          <w:numId w:val="2"/>
+        </w:numPr>
+        <w:spacing w:after="120"/>
+        <w:jc w:val="both"/>
+      </w:pPr>
+      <w:r>
+        <w:rPr>
+          <w:b/>
+          <w:color w:val="0A1F33"/>
+          <w:sz w:val="20"/>
+        </w:rPr>
+        <w:t xml:space="preserve">Button: </w:t>
+      </w:r>
+      <w:r>
+        <w:rPr>
+          <w:color w:val="0A1F33"/>
+          <w:sz w:val="20"/>
+        </w:rPr>
+        <w:t>Schedule a consultation (links to #contact)</w:t>
+      </w:r>
+    </w:p>
+    <w:p>
+      <w:pPr>
+        <w:spacing w:after="120"/>
+      </w:pPr>
+    </w:p>
+    <w:p>
+      <w:pPr>
+        <w:pStyle w:val="Heading1"/>
+        <w:keepNext/>
+      </w:pPr>
+      <w:r>
+        <w:t>16. Existing Blocks Kept As They Are</w:t>
       </w:r>
     </w:p>
     <w:p>

</xml_diff>

<commit_message>
Make reimplementation signs more technically specific
Co-Authored-By: Claude Sonnet 5.5 <noreply@anthropic.com>
Claude-Session: https://claude.ai/code/session_01EvNjF6Z24XTpLixWRFRe99
</commit_message>
<xml_diff>
--- a/crm-page/crm-solutions-uae-content.docx
+++ b/crm-page/crm-solutions-uae-content.docx
@@ -2849,7 +2849,7 @@
           <w:color w:val="0A1F33"/>
           <w:sz w:val="20"/>
         </w:rPr>
-        <w:t>Seven-item list, shown in two columns:</w:t>
+        <w:t>Eight-item list, shown in two columns:</w:t>
       </w:r>
     </w:p>
     <w:p>
@@ -2867,7 +2867,7 @@
           <w:color w:val="0A1F33"/>
           <w:sz w:val="20"/>
         </w:rPr>
-        <w:t>Your team avoids the CRM, or updates it days after the event.</w:t>
+        <w:t>Duplicate and conflicting records keep appearing because contacts, accounts and leads have no matching or deduplication rules.</w:t>
       </w:r>
     </w:p>
     <w:p>
@@ -2885,7 +2885,7 @@
           <w:color w:val="0A1F33"/>
           <w:sz w:val="20"/>
         </w:rPr>
-        <w:t>Two reports show two different numbers, so nobody trusts either.</w:t>
+        <w:t>The data model no longer fits your business. Stages and fields were built for an old process, so teams cram details into free-text notes.</w:t>
       </w:r>
     </w:p>
     <w:p>
@@ -2903,7 +2903,7 @@
           <w:color w:val="0A1F33"/>
           <w:sz w:val="20"/>
         </w:rPr>
-        <w:t>The CRM no longer matches how you sell or serve after growth, new products or a new structure.</w:t>
+        <w:t>Workflows and approvals rely on old custom code or manual workarounds that nobody fully understands, so every change risks breaking something.</w:t>
       </w:r>
     </w:p>
     <w:p>
@@ -2921,7 +2921,7 @@
           <w:color w:val="0A1F33"/>
           <w:sz w:val="20"/>
         </w:rPr>
-        <w:t>Staff keep private spreadsheets as a backup.</w:t>
+        <w:t>ERP, finance and email links run on file exports instead of live integrations, so customer data is stale or differs between systems.</w:t>
       </w:r>
     </w:p>
     <w:p>
@@ -2939,7 +2939,7 @@
           <w:color w:val="0A1F33"/>
           <w:sz w:val="20"/>
         </w:rPr>
-        <w:t>Duplicate, outdated or missing records slow everyone down.</w:t>
+        <w:t>Screens, searches and reports load slowly because of overloaded layouts, unindexed fields or years of unarchived data.</w:t>
       </w:r>
     </w:p>
     <w:p>
@@ -2957,7 +2957,7 @@
           <w:color w:val="0A1F33"/>
           <w:sz w:val="20"/>
         </w:rPr>
-        <w:t>Adding a user, team or branch has become slow and painful.</w:t>
+        <w:t>Roles and permissions have drifted, so some users see data they should not, others cannot reach what they need, and the audit trail has gaps.</w:t>
       </w:r>
     </w:p>
     <w:p>
@@ -2975,7 +2975,25 @@
           <w:color w:val="0A1F33"/>
           <w:sz w:val="20"/>
         </w:rPr>
-        <w:t>Your ERP, email or finance system is not connected to the CRM.</w:t>
+        <w:t>The CRM version is outdated or heavily customised, so upgrades keep getting postponed and you miss security patches and newer features such as AI.</w:t>
+      </w:r>
+    </w:p>
+    <w:p>
+      <w:pPr>
+        <w:pStyle w:val="ListParagraph"/>
+        <w:numPr>
+          <w:ilvl w:val="0"/>
+          <w:numId w:val="2"/>
+        </w:numPr>
+        <w:spacing w:after="60"/>
+        <w:jc w:val="both"/>
+      </w:pPr>
+      <w:r>
+        <w:rPr>
+          <w:color w:val="0A1F33"/>
+          <w:sz w:val="20"/>
+        </w:rPr>
+        <w:t>Adoption is low. Users update records late, and managers forecast from offline spreadsheets instead of CRM reports.</w:t>
       </w:r>
     </w:p>
     <w:p>

</xml_diff>